<commit_message>
docs: Update dokumentasi dengan tampilan edit dan delete
</commit_message>
<xml_diff>
--- a/pertemuan 14/dokumentasi.docx
+++ b/pertemuan 14/dokumentasi.docx
@@ -1,141 +1,356 @@
 
 <file path=word/document.xml><?xml version="1.0" encoding="utf-8"?>
-<w:document xmlns:w="http://schemas.openxmlformats.org/wordprocessingml/2006/main" xmlns:m="http://schemas.openxmlformats.org/officeDocument/2006/math" xmlns:r="http://schemas.openxmlformats.org/officeDocument/2006/relationships" xmlns:o="urn:schemas-microsoft-com:office:office" xmlns:v="urn:schemas-microsoft-com:vml" xmlns:w10="urn:schemas-microsoft-com:office:word" xmlns:a="http://schemas.openxmlformats.org/drawingml/2006/main" xmlns:pic="http://schemas.openxmlformats.org/drawingml/2006/picture" xmlns:wp="http://schemas.openxmlformats.org/drawingml/2006/wordprocessingDrawing">
+<w:document xmlns:wpc="http://schemas.microsoft.com/office/word/2010/wordprocessingCanvas" xmlns:cx="http://schemas.microsoft.com/office/drawing/2014/chartex" xmlns:cx1="http://schemas.microsoft.com/office/drawing/2015/9/8/chartex" xmlns:cx2="http://schemas.microsoft.com/office/drawing/2015/10/21/chartex" xmlns:cx3="http://schemas.microsoft.com/office/drawing/2016/5/9/chartex" xmlns:cx4="http://schemas.microsoft.com/office/drawing/2016/5/10/chartex" xmlns:cx5="http://schemas.microsoft.com/office/drawing/2016/5/11/chartex" xmlns:cx6="http://schemas.microsoft.com/office/drawing/2016/5/12/chartex" xmlns:cx7="http://schemas.microsoft.com/office/drawing/2016/5/13/chartex" xmlns:cx8="http://schemas.microsoft.com/office/drawing/2016/5/14/chartex" xmlns:mc="http://schemas.openxmlformats.org/markup-compatibility/2006" xmlns:aink="http://schemas.microsoft.com/office/drawing/2016/ink" xmlns:am3d="http://schemas.microsoft.com/office/drawing/2017/model3d" xmlns:o="urn:schemas-microsoft-com:office:office" xmlns:oel="http://schemas.microsoft.com/office/2019/extlst" xmlns:r="http://schemas.openxmlformats.org/officeDocument/2006/relationships" xmlns:m="http://schemas.openxmlformats.org/officeDocument/2006/math" xmlns:v="urn:schemas-microsoft-com:vml" xmlns:wp14="http://schemas.microsoft.com/office/word/2010/wordprocessingDrawing" xmlns:wp="http://schemas.openxmlformats.org/drawingml/2006/wordprocessingDrawing" xmlns:w10="urn:schemas-microsoft-com:office:word" xmlns:w="http://schemas.openxmlformats.org/wordprocessingml/2006/main" xmlns:w14="http://schemas.microsoft.com/office/word/2010/wordml" xmlns:w15="http://schemas.microsoft.com/office/word/2012/wordml" xmlns:w16cex="http://schemas.microsoft.com/office/word/2018/wordml/cex" xmlns:w16cid="http://schemas.microsoft.com/office/word/2016/wordml/cid" xmlns:w16="http://schemas.microsoft.com/office/word/2018/wordml" xmlns:w16sdtdh="http://schemas.microsoft.com/office/word/2020/wordml/sdtdatahash" xmlns:w16se="http://schemas.microsoft.com/office/word/2015/wordml/symex" xmlns:wpg="http://schemas.microsoft.com/office/word/2010/wordprocessingGroup" xmlns:wpi="http://schemas.microsoft.com/office/word/2010/wordprocessingInk" xmlns:wne="http://schemas.microsoft.com/office/word/2006/wordml" xmlns:wps="http://schemas.microsoft.com/office/word/2010/wordprocessingShape" mc:Ignorable="w14 w15 w16se w16cid w16 w16cex w16sdtdh wp14">
   <w:body>
-    <w:bookmarkStart w:id="39" w:name="X0e0201e81bda74ced9b9d476ad684fc4231eb23"/>
     <w:p>
       <w:pPr>
         <w:pStyle w:val="Heading1"/>
       </w:pPr>
-      <w:r>
-        <w:t xml:space="preserve">Dokumentasi JavaScript Dasar (Pertemuan 14)</w:t>
+      <w:bookmarkStart w:id="0" w:name="X0e0201e81bda74ced9b9d476ad684fc4231eb23"/>
+      <w:r>
+        <w:t>Dokumentasi JavaScript Dasar (Pertemuan 14)</w:t>
+      </w:r>
+    </w:p>
+    <w:tbl>
+      <w:tblPr>
+        <w:tblpPr w:leftFromText="180" w:rightFromText="180" w:vertAnchor="text" w:horzAnchor="margin" w:tblpXSpec="right" w:tblpY="251"/>
+        <w:tblW w:w="0" w:type="auto"/>
+        <w:tblLook w:val="04A0" w:firstRow="1" w:lastRow="0" w:firstColumn="1" w:lastColumn="0" w:noHBand="0" w:noVBand="1"/>
+      </w:tblPr>
+      <w:tblGrid>
+        <w:gridCol w:w="1476"/>
+        <w:gridCol w:w="6588"/>
+      </w:tblGrid>
+      <w:tr>
+        <w:tc>
+          <w:tcPr>
+            <w:tcW w:w="1476" w:type="dxa"/>
+            <w:shd w:val="clear" w:color="auto" w:fill="auto"/>
+            <w:vAlign w:val="center"/>
+          </w:tcPr>
+          <w:p>
+            <w:pPr>
+              <w:jc w:val="both"/>
+              <w:rPr>
+                <w:rFonts w:ascii="Times New Roman" w:hAnsi="Times New Roman" w:cs="Times New Roman"/>
+                <w:color w:val="0D0D0D" w:themeColor="text1" w:themeTint="F2"/>
+              </w:rPr>
+            </w:pPr>
+            <w:r>
+              <w:rPr>
+                <w:rFonts w:ascii="Times New Roman" w:hAnsi="Times New Roman" w:cs="Times New Roman"/>
+                <w:b/>
+                <w:color w:val="0D0D0D" w:themeColor="text1" w:themeTint="F2"/>
+                <w:sz w:val="20"/>
+              </w:rPr>
+              <w:t>Nama</w:t>
+            </w:r>
+          </w:p>
+        </w:tc>
+        <w:tc>
+          <w:tcPr>
+            <w:tcW w:w="6588" w:type="dxa"/>
+            <w:shd w:val="clear" w:color="auto" w:fill="auto"/>
+            <w:vAlign w:val="center"/>
+          </w:tcPr>
+          <w:p>
+            <w:pPr>
+              <w:jc w:val="both"/>
+              <w:rPr>
+                <w:rFonts w:ascii="Times New Roman" w:hAnsi="Times New Roman" w:cs="Times New Roman"/>
+                <w:color w:val="0D0D0D" w:themeColor="text1" w:themeTint="F2"/>
+              </w:rPr>
+            </w:pPr>
+            <w:r>
+              <w:rPr>
+                <w:rFonts w:ascii="Times New Roman" w:hAnsi="Times New Roman" w:cs="Times New Roman"/>
+                <w:color w:val="0D0D0D" w:themeColor="text1" w:themeTint="F2"/>
+                <w:sz w:val="20"/>
+              </w:rPr>
+              <w:t>: Maulana Royyan Tsubaisa</w:t>
+            </w:r>
+          </w:p>
+        </w:tc>
+      </w:tr>
+      <w:tr>
+        <w:tc>
+          <w:tcPr>
+            <w:tcW w:w="1476" w:type="dxa"/>
+            <w:shd w:val="clear" w:color="auto" w:fill="auto"/>
+            <w:vAlign w:val="center"/>
+          </w:tcPr>
+          <w:p>
+            <w:pPr>
+              <w:jc w:val="both"/>
+              <w:rPr>
+                <w:rFonts w:ascii="Times New Roman" w:hAnsi="Times New Roman" w:cs="Times New Roman"/>
+                <w:color w:val="0D0D0D" w:themeColor="text1" w:themeTint="F2"/>
+              </w:rPr>
+            </w:pPr>
+            <w:r>
+              <w:rPr>
+                <w:rFonts w:ascii="Times New Roman" w:hAnsi="Times New Roman" w:cs="Times New Roman"/>
+                <w:b/>
+                <w:color w:val="0D0D0D" w:themeColor="text1" w:themeTint="F2"/>
+                <w:sz w:val="20"/>
+              </w:rPr>
+              <w:t>NIM</w:t>
+            </w:r>
+          </w:p>
+        </w:tc>
+        <w:tc>
+          <w:tcPr>
+            <w:tcW w:w="6588" w:type="dxa"/>
+            <w:shd w:val="clear" w:color="auto" w:fill="auto"/>
+            <w:vAlign w:val="center"/>
+          </w:tcPr>
+          <w:p>
+            <w:pPr>
+              <w:jc w:val="both"/>
+              <w:rPr>
+                <w:rFonts w:ascii="Times New Roman" w:hAnsi="Times New Roman" w:cs="Times New Roman"/>
+                <w:color w:val="0D0D0D" w:themeColor="text1" w:themeTint="F2"/>
+              </w:rPr>
+            </w:pPr>
+            <w:r>
+              <w:rPr>
+                <w:rFonts w:ascii="Times New Roman" w:hAnsi="Times New Roman" w:cs="Times New Roman"/>
+                <w:color w:val="0D0D0D" w:themeColor="text1" w:themeTint="F2"/>
+                <w:sz w:val="20"/>
+              </w:rPr>
+              <w:t>: 231011450122</w:t>
+            </w:r>
+          </w:p>
+        </w:tc>
+      </w:tr>
+      <w:tr>
+        <w:tc>
+          <w:tcPr>
+            <w:tcW w:w="1476" w:type="dxa"/>
+            <w:shd w:val="clear" w:color="auto" w:fill="auto"/>
+            <w:vAlign w:val="center"/>
+          </w:tcPr>
+          <w:p>
+            <w:pPr>
+              <w:jc w:val="both"/>
+              <w:rPr>
+                <w:rFonts w:ascii="Times New Roman" w:hAnsi="Times New Roman" w:cs="Times New Roman"/>
+                <w:color w:val="0D0D0D" w:themeColor="text1" w:themeTint="F2"/>
+              </w:rPr>
+            </w:pPr>
+            <w:proofErr w:type="spellStart"/>
+            <w:r>
+              <w:rPr>
+                <w:rFonts w:ascii="Times New Roman" w:hAnsi="Times New Roman" w:cs="Times New Roman"/>
+                <w:b/>
+                <w:color w:val="0D0D0D" w:themeColor="text1" w:themeTint="F2"/>
+                <w:sz w:val="20"/>
+              </w:rPr>
+              <w:t>Kelas</w:t>
+            </w:r>
+            <w:proofErr w:type="spellEnd"/>
+          </w:p>
+        </w:tc>
+        <w:tc>
+          <w:tcPr>
+            <w:tcW w:w="6588" w:type="dxa"/>
+            <w:shd w:val="clear" w:color="auto" w:fill="auto"/>
+            <w:vAlign w:val="center"/>
+          </w:tcPr>
+          <w:p>
+            <w:pPr>
+              <w:jc w:val="both"/>
+              <w:rPr>
+                <w:rFonts w:ascii="Times New Roman" w:hAnsi="Times New Roman" w:cs="Times New Roman"/>
+                <w:color w:val="0D0D0D" w:themeColor="text1" w:themeTint="F2"/>
+              </w:rPr>
+            </w:pPr>
+            <w:r>
+              <w:rPr>
+                <w:rFonts w:ascii="Times New Roman" w:hAnsi="Times New Roman" w:cs="Times New Roman"/>
+                <w:color w:val="0D0D0D" w:themeColor="text1" w:themeTint="F2"/>
+                <w:sz w:val="20"/>
+              </w:rPr>
+              <w:t>: 05TPLE005</w:t>
+            </w:r>
+          </w:p>
+        </w:tc>
+      </w:tr>
+      <w:tr>
+        <w:trPr>
+          <w:trHeight w:val="80"/>
+        </w:trPr>
+        <w:tc>
+          <w:tcPr>
+            <w:tcW w:w="1476" w:type="dxa"/>
+            <w:shd w:val="clear" w:color="auto" w:fill="auto"/>
+            <w:vAlign w:val="center"/>
+          </w:tcPr>
+          <w:p>
+            <w:pPr>
+              <w:jc w:val="both"/>
+              <w:rPr>
+                <w:rFonts w:ascii="Times New Roman" w:hAnsi="Times New Roman" w:cs="Times New Roman"/>
+                <w:color w:val="0D0D0D" w:themeColor="text1" w:themeTint="F2"/>
+              </w:rPr>
+            </w:pPr>
+            <w:r>
+              <w:rPr>
+                <w:rFonts w:ascii="Times New Roman" w:hAnsi="Times New Roman" w:cs="Times New Roman"/>
+                <w:b/>
+                <w:color w:val="0D0D0D" w:themeColor="text1" w:themeTint="F2"/>
+                <w:sz w:val="20"/>
+              </w:rPr>
+              <w:t xml:space="preserve">Mata </w:t>
+            </w:r>
+            <w:proofErr w:type="spellStart"/>
+            <w:r>
+              <w:rPr>
+                <w:rFonts w:ascii="Times New Roman" w:hAnsi="Times New Roman" w:cs="Times New Roman"/>
+                <w:b/>
+                <w:color w:val="0D0D0D" w:themeColor="text1" w:themeTint="F2"/>
+                <w:sz w:val="20"/>
+              </w:rPr>
+              <w:t>Kuliah</w:t>
+            </w:r>
+            <w:proofErr w:type="spellEnd"/>
+          </w:p>
+        </w:tc>
+        <w:tc>
+          <w:tcPr>
+            <w:tcW w:w="6588" w:type="dxa"/>
+            <w:shd w:val="clear" w:color="auto" w:fill="auto"/>
+            <w:vAlign w:val="center"/>
+          </w:tcPr>
+          <w:p>
+            <w:pPr>
+              <w:jc w:val="both"/>
+              <w:rPr>
+                <w:rFonts w:ascii="Times New Roman" w:hAnsi="Times New Roman" w:cs="Times New Roman"/>
+                <w:color w:val="0D0D0D" w:themeColor="text1" w:themeTint="F2"/>
+              </w:rPr>
+            </w:pPr>
+            <w:r>
+              <w:rPr>
+                <w:rFonts w:ascii="Times New Roman" w:hAnsi="Times New Roman" w:cs="Times New Roman"/>
+                <w:color w:val="0D0D0D" w:themeColor="text1" w:themeTint="F2"/>
+                <w:sz w:val="20"/>
+              </w:rPr>
+              <w:t xml:space="preserve">: </w:t>
+            </w:r>
+            <w:proofErr w:type="spellStart"/>
+            <w:r>
+              <w:rPr>
+                <w:rFonts w:ascii="Times New Roman" w:hAnsi="Times New Roman" w:cs="Times New Roman"/>
+                <w:color w:val="0D0D0D" w:themeColor="text1" w:themeTint="F2"/>
+                <w:sz w:val="20"/>
+              </w:rPr>
+              <w:t>Pemrograman</w:t>
+            </w:r>
+            <w:proofErr w:type="spellEnd"/>
+            <w:r>
+              <w:rPr>
+                <w:rFonts w:ascii="Times New Roman" w:hAnsi="Times New Roman" w:cs="Times New Roman"/>
+                <w:color w:val="0D0D0D" w:themeColor="text1" w:themeTint="F2"/>
+                <w:sz w:val="20"/>
+              </w:rPr>
+              <w:t xml:space="preserve"> Web 1</w:t>
+            </w:r>
+          </w:p>
+        </w:tc>
+      </w:tr>
+    </w:tbl>
+    <w:p/>
+    <w:p/>
+    <w:p/>
+    <w:p/>
+    <w:p/>
+    <w:p>
+      <w:r>
+        <w:pict w14:anchorId="5DB0CE58">
+          <v:rect id="_x0000_i1025" style="width:0;height:1.5pt" o:hralign="center" o:hrstd="t" o:hr="t"/>
+        </w:pict>
+      </w:r>
+    </w:p>
+    <w:p>
+      <w:pPr>
+        <w:pStyle w:val="Heading2"/>
+      </w:pPr>
+      <w:bookmarkStart w:id="1" w:name="pendahuluan"/>
+      <w:r>
+        <w:t>1. Pendahuluan</w:t>
       </w:r>
     </w:p>
     <w:p>
       <w:pPr>
         <w:pStyle w:val="FirstParagraph"/>
       </w:pPr>
+      <w:r>
+        <w:t xml:space="preserve">Dokumentasi ini berisi penjelasan dan hasil pengerjaan praktik JavaScript Dasar pada </w:t>
+      </w:r>
       <w:r>
         <w:rPr>
           <w:b/>
           <w:bCs/>
         </w:rPr>
-        <w:t xml:space="preserve">Maulana Royyan Tsubaisa | Universitas Pamulang</w:t>
-      </w:r>
-    </w:p>
-    <w:p>
-      <w:r>
-        <w:pict>
-          <v:rect style="width:0;height:1.5pt" o:hralign="center" o:hrstd="t" o:hr="t"/>
-        </w:pict>
-      </w:r>
-    </w:p>
-    <w:bookmarkStart w:id="20" w:name="pendahuluan"/>
-    <w:p>
-      <w:pPr>
-        <w:pStyle w:val="Heading2"/>
-      </w:pPr>
-      <w:r>
-        <w:t xml:space="preserve">1. Pendahuluan</w:t>
-      </w:r>
-    </w:p>
-    <w:p>
-      <w:pPr>
-        <w:pStyle w:val="FirstParagraph"/>
-      </w:pPr>
-      <w:r>
-        <w:t xml:space="preserve">Dokumentasi ini berisi penjelasan dan hasil pengerjaan praktik JavaScript Dasar pada</w:t>
-      </w:r>
-      <w:r>
-        <w:t xml:space="preserve"> </w:t>
-      </w:r>
-      <w:r>
-        <w:rPr>
-          <w:b/>
-          <w:bCs/>
-        </w:rPr>
-        <w:t xml:space="preserve">Pertemuan 14</w:t>
-      </w:r>
-      <w:r>
-        <w:t xml:space="preserve">. Latihan ini mencakup pemahaman tentang:</w:t>
-      </w:r>
-      <w:r>
-        <w:t xml:space="preserve"> </w:t>
-      </w:r>
-      <w:r>
-        <w:t xml:space="preserve">- Manipulasi Array (</w:t>
+        <w:t>Pertemuan 14</w:t>
+      </w:r>
+      <w:r>
+        <w:t>. Latihan ini mencakup pemahaman tentang: - Manipulasi Array (</w:t>
       </w:r>
       <w:r>
         <w:rPr>
           <w:rStyle w:val="VerbatimChar"/>
         </w:rPr>
-        <w:t xml:space="preserve">js_array.html</w:t>
-      </w:r>
-      <w:r>
-        <w:t xml:space="preserve">)</w:t>
-      </w:r>
-      <w:r>
-        <w:t xml:space="preserve"> </w:t>
-      </w:r>
-      <w:r>
-        <w:t xml:space="preserve">- Manipulasi Objek dan Array of Objects (</w:t>
+        <w:t>js_array.html</w:t>
+      </w:r>
+      <w:r>
+        <w:t>) - Manipulasi Objek dan Array of Objects (</w:t>
       </w:r>
       <w:r>
         <w:rPr>
           <w:rStyle w:val="VerbatimChar"/>
         </w:rPr>
-        <w:t xml:space="preserve">js_object.html</w:t>
-      </w:r>
-      <w:r>
-        <w:t xml:space="preserve">)</w:t>
-      </w:r>
-      <w:r>
-        <w:t xml:space="preserve"> </w:t>
-      </w:r>
-      <w:r>
-        <w:t xml:space="preserve">- Manipulasi DOM (Document Object Model) untuk membuat Form CRUD sederhana di sisi</w:t>
-      </w:r>
-      <w:r>
-        <w:t xml:space="preserve"> </w:t>
+        <w:t>js_object.html</w:t>
+      </w:r>
+      <w:r>
+        <w:t xml:space="preserve">) - Manipulasi DOM (Document Object Model) untuk membuat Form CRUD sederhana di sisi </w:t>
       </w:r>
       <w:r>
         <w:rPr>
           <w:i/>
           <w:iCs/>
         </w:rPr>
-        <w:t xml:space="preserve">client</w:t>
-      </w:r>
-      <w:r>
-        <w:t xml:space="preserve"> </w:t>
-      </w:r>
-      <w:r>
-        <w:t xml:space="preserve">tanpa terhubung ke database (</w:t>
+        <w:t>client</w:t>
+      </w:r>
+      <w:r>
+        <w:t xml:space="preserve"> tanpa terhubung ke database (</w:t>
       </w:r>
       <w:r>
         <w:rPr>
           <w:rStyle w:val="VerbatimChar"/>
         </w:rPr>
-        <w:t xml:space="preserve">js.html</w:t>
-      </w:r>
-      <w:r>
-        <w:t xml:space="preserve">).</w:t>
-      </w:r>
-    </w:p>
-    <w:p>
-      <w:r>
-        <w:pict>
-          <v:rect style="width:0;height:1.5pt" o:hralign="center" o:hrstd="t" o:hr="t"/>
+        <w:t>js.html</w:t>
+      </w:r>
+      <w:r>
+        <w:t>).</w:t>
+      </w:r>
+    </w:p>
+    <w:p>
+      <w:r>
+        <w:pict w14:anchorId="62E8F5E9">
+          <v:rect id="_x0000_i1026" style="width:0;height:1.5pt" o:hralign="center" o:hrstd="t" o:hr="t"/>
         </w:pict>
       </w:r>
     </w:p>
-    <w:bookmarkEnd w:id="20"/>
-    <w:bookmarkStart w:id="21" w:name="struktur-file"/>
     <w:p>
       <w:pPr>
         <w:pStyle w:val="Heading2"/>
       </w:pPr>
-      <w:r>
-        <w:t xml:space="preserve">2. Struktur File</w:t>
+      <w:bookmarkStart w:id="2" w:name="struktur-file"/>
+      <w:bookmarkEnd w:id="1"/>
+      <w:r>
+        <w:t>2. Struktur File</w:t>
       </w:r>
     </w:p>
     <w:p>
@@ -143,99 +358,69 @@
         <w:pStyle w:val="FirstParagraph"/>
       </w:pPr>
       <w:r>
-        <w:t xml:space="preserve">Terdapat tiga file HTML yang digunakan dalam latihan ini:</w:t>
-      </w:r>
-      <w:r>
-        <w:t xml:space="preserve"> </w:t>
-      </w:r>
-      <w:r>
-        <w:t xml:space="preserve">-</w:t>
-      </w:r>
-      <w:r>
-        <w:t xml:space="preserve"> </w:t>
+        <w:t xml:space="preserve">Terdapat tiga file HTML yang digunakan dalam latihan ini: - </w:t>
       </w:r>
       <w:r>
         <w:rPr>
           <w:rStyle w:val="VerbatimChar"/>
         </w:rPr>
-        <w:t xml:space="preserve">js.html</w:t>
-      </w:r>
-      <w:r>
-        <w:t xml:space="preserve">: Program interaktif CRUD Data Mahasiswa menggunakan JavaScript Form dan DOM.</w:t>
-      </w:r>
-      <w:r>
-        <w:t xml:space="preserve"> </w:t>
-      </w:r>
-      <w:r>
-        <w:t xml:space="preserve">-</w:t>
-      </w:r>
-      <w:r>
-        <w:t xml:space="preserve"> </w:t>
+        <w:t>js.html</w:t>
+      </w:r>
+      <w:r>
+        <w:t xml:space="preserve">: Program interaktif CRUD Data Mahasiswa menggunakan JavaScript Form dan DOM. - </w:t>
       </w:r>
       <w:r>
         <w:rPr>
           <w:rStyle w:val="VerbatimChar"/>
         </w:rPr>
-        <w:t xml:space="preserve">js_array.html</w:t>
-      </w:r>
-      <w:r>
-        <w:t xml:space="preserve">: Program console log yang mensimulasikan penggunaan tipe data Array.</w:t>
-      </w:r>
-      <w:r>
-        <w:t xml:space="preserve"> </w:t>
-      </w:r>
-      <w:r>
-        <w:t xml:space="preserve">-</w:t>
-      </w:r>
-      <w:r>
-        <w:t xml:space="preserve"> </w:t>
+        <w:t>js_array.html</w:t>
+      </w:r>
+      <w:r>
+        <w:t xml:space="preserve">: Program console log yang mensimulasikan penggunaan tipe data Array. - </w:t>
       </w:r>
       <w:r>
         <w:rPr>
           <w:rStyle w:val="VerbatimChar"/>
         </w:rPr>
-        <w:t xml:space="preserve">js_object.html</w:t>
-      </w:r>
-      <w:r>
-        <w:t xml:space="preserve">: Program console log yang mensimulasikan penggunaan tipe data Object dan struktur yang lebih kompleks.</w:t>
-      </w:r>
-    </w:p>
-    <w:p>
-      <w:r>
-        <w:pict>
-          <v:rect style="width:0;height:1.5pt" o:hralign="center" o:hrstd="t" o:hr="t"/>
+        <w:t>js_object.html</w:t>
+      </w:r>
+      <w:r>
+        <w:t>: Program console log yang mensimulasikan penggunaan tipe data Object dan struktur yang lebih kompleks.</w:t>
+      </w:r>
+    </w:p>
+    <w:p>
+      <w:r>
+        <w:pict w14:anchorId="1E2ED3B9">
+          <v:rect id="_x0000_i1027" style="width:0;height:1.5pt" o:hralign="center" o:hrstd="t" o:hr="t"/>
         </w:pict>
       </w:r>
     </w:p>
-    <w:bookmarkEnd w:id="21"/>
-    <w:bookmarkStart w:id="37" w:name="implementasi-kode-dan-tampilan"/>
     <w:p>
       <w:pPr>
         <w:pStyle w:val="Heading2"/>
       </w:pPr>
-      <w:r>
-        <w:t xml:space="preserve">3. Implementasi Kode dan Tampilan</w:t>
-      </w:r>
-    </w:p>
-    <w:bookmarkStart w:id="28" w:name="X44b3ff17a86a54f48c93fb20e6cf96c4c2baed6"/>
+      <w:bookmarkStart w:id="3" w:name="implementasi-kode-dan-tampilan"/>
+      <w:bookmarkEnd w:id="2"/>
+      <w:r>
+        <w:t>3. Implementasi Kode dan Tampilan</w:t>
+      </w:r>
+    </w:p>
     <w:p>
       <w:pPr>
         <w:pStyle w:val="Heading3"/>
       </w:pPr>
-      <w:r>
-        <w:t xml:space="preserve">3.1 Manipulasi DOM &amp; Array (Form Data Mahasiswa -</w:t>
-      </w:r>
-      <w:r>
-        <w:t xml:space="preserve"> </w:t>
+      <w:bookmarkStart w:id="4" w:name="X44b3ff17a86a54f48c93fb20e6cf96c4c2baed6"/>
+      <w:r>
+        <w:t xml:space="preserve">3.1 Manipulasi DOM &amp; Array (Form Data Mahasiswa - </w:t>
       </w:r>
       <w:r>
         <w:rPr>
           <w:rStyle w:val="VerbatimChar"/>
         </w:rPr>
-        <w:t xml:space="preserve">js.html</w:t>
-      </w:r>
-      <w:r>
-        <w:t xml:space="preserve">)</w:t>
+        <w:t>js.html</w:t>
+      </w:r>
+      <w:r>
+        <w:t>)</w:t>
       </w:r>
     </w:p>
     <w:p>
@@ -243,7 +428,7 @@
         <w:pStyle w:val="FirstParagraph"/>
       </w:pPr>
       <w:r>
-        <w:t xml:space="preserve">File ini berisikan form input data mahasiswa sederhana (NIM, Nama, Jurusan, Fakultas) yang ditangani seluruhnya dengan JavaScript.</w:t>
+        <w:t>File ini berisikan form input data mahasiswa sederhana (NIM, Nama, Jurusan, Fakultas) yang ditangani seluruhnya dengan JavaScript.</w:t>
       </w:r>
     </w:p>
     <w:p>
@@ -251,11 +436,11 @@
         <w:pStyle w:val="Compact"/>
         <w:numPr>
           <w:ilvl w:val="0"/>
-          <w:numId w:val="1001"/>
+          <w:numId w:val="2"/>
         </w:numPr>
       </w:pPr>
       <w:r>
-        <w:t xml:space="preserve">Form menggunakan style CSS berbasis Neumorphism.</w:t>
+        <w:t>Form menggunakan style CSS berbasis Neumorphism.</w:t>
       </w:r>
     </w:p>
     <w:p>
@@ -263,23 +448,20 @@
         <w:pStyle w:val="Compact"/>
         <w:numPr>
           <w:ilvl w:val="0"/>
-          <w:numId w:val="1001"/>
+          <w:numId w:val="2"/>
         </w:numPr>
       </w:pPr>
       <w:r>
-        <w:t xml:space="preserve">Seluruh state data mahasiswa disimpan pada sebuah variabel array global bernama</w:t>
-      </w:r>
-      <w:r>
-        <w:t xml:space="preserve"> </w:t>
+        <w:t xml:space="preserve">Seluruh state data mahasiswa disimpan pada sebuah variabel array global bernama </w:t>
       </w:r>
       <w:r>
         <w:rPr>
           <w:rStyle w:val="VerbatimChar"/>
         </w:rPr>
-        <w:t xml:space="preserve">dataMahasiswa</w:t>
-      </w:r>
-      <w:r>
-        <w:t xml:space="preserve">.</w:t>
+        <w:t>dataMahasiswa</w:t>
+      </w:r>
+      <w:r>
+        <w:t>.</w:t>
       </w:r>
     </w:p>
     <w:p>
@@ -287,98 +469,74 @@
         <w:pStyle w:val="Compact"/>
         <w:numPr>
           <w:ilvl w:val="0"/>
-          <w:numId w:val="1001"/>
+          <w:numId w:val="2"/>
         </w:numPr>
       </w:pPr>
       <w:r>
-        <w:t xml:space="preserve">Terdapat fungsi</w:t>
-      </w:r>
-      <w:r>
-        <w:t xml:space="preserve"> </w:t>
+        <w:t xml:space="preserve">Terdapat fungsi </w:t>
       </w:r>
       <w:r>
         <w:rPr>
           <w:rStyle w:val="VerbatimChar"/>
         </w:rPr>
-        <w:t xml:space="preserve">tambahData()</w:t>
-      </w:r>
-      <w:r>
-        <w:t xml:space="preserve">,</w:t>
-      </w:r>
-      <w:r>
-        <w:t xml:space="preserve"> </w:t>
+        <w:t>tambahData()</w:t>
+      </w:r>
+      <w:r>
+        <w:t xml:space="preserve">, </w:t>
       </w:r>
       <w:r>
         <w:rPr>
           <w:rStyle w:val="VerbatimChar"/>
         </w:rPr>
-        <w:t xml:space="preserve">tampilkanData()</w:t>
-      </w:r>
-      <w:r>
-        <w:t xml:space="preserve">,</w:t>
-      </w:r>
-      <w:r>
-        <w:t xml:space="preserve"> </w:t>
+        <w:t>tampilkanData()</w:t>
+      </w:r>
+      <w:r>
+        <w:t xml:space="preserve">, </w:t>
       </w:r>
       <w:r>
         <w:rPr>
           <w:rStyle w:val="VerbatimChar"/>
         </w:rPr>
-        <w:t xml:space="preserve">editData()</w:t>
-      </w:r>
-      <w:r>
-        <w:t xml:space="preserve">,</w:t>
-      </w:r>
-      <w:r>
-        <w:t xml:space="preserve"> </w:t>
+        <w:t>editData()</w:t>
+      </w:r>
+      <w:r>
+        <w:t xml:space="preserve">, </w:t>
       </w:r>
       <w:r>
         <w:rPr>
           <w:rStyle w:val="VerbatimChar"/>
         </w:rPr>
-        <w:t xml:space="preserve">updateData()</w:t>
-      </w:r>
-      <w:r>
-        <w:t xml:space="preserve">,</w:t>
-      </w:r>
-      <w:r>
-        <w:t xml:space="preserve"> </w:t>
+        <w:t>updateData()</w:t>
+      </w:r>
+      <w:r>
+        <w:t xml:space="preserve">, </w:t>
       </w:r>
       <w:r>
         <w:rPr>
           <w:rStyle w:val="VerbatimChar"/>
         </w:rPr>
-        <w:t xml:space="preserve">hapusData()</w:t>
-      </w:r>
-      <w:r>
-        <w:t xml:space="preserve">, dan</w:t>
-      </w:r>
-      <w:r>
-        <w:t xml:space="preserve"> </w:t>
+        <w:t>hapusData()</w:t>
+      </w:r>
+      <w:r>
+        <w:t xml:space="preserve">, dan </w:t>
       </w:r>
       <w:r>
         <w:rPr>
           <w:rStyle w:val="VerbatimChar"/>
         </w:rPr>
-        <w:t xml:space="preserve">kosongkanForm()</w:t>
-      </w:r>
-      <w:r>
-        <w:t xml:space="preserve"> </w:t>
-      </w:r>
-      <w:r>
-        <w:t xml:space="preserve">yang merender ulang DOM secara langsung menggunakan</w:t>
-      </w:r>
-      <w:r>
-        <w:t xml:space="preserve"> </w:t>
+        <w:t>kosongkanForm()</w:t>
+      </w:r>
+      <w:r>
+        <w:t xml:space="preserve"> yang merender ulang DOM secara langsung menggunakan </w:t>
       </w:r>
       <w:r>
         <w:rPr>
           <w:rStyle w:val="VerbatimChar"/>
         </w:rPr>
-        <w:t xml:space="preserve">.innerHTML</w:t>
-      </w:r>
-      <w:r>
-        <w:t xml:space="preserve">.</w:t>
+        <w:t>.innerHTML</w:t>
+      </w:r>
+      <w:r>
+        <w:t>.</w:t>
       </w:r>
     </w:p>
     <w:p>
@@ -390,28 +548,33 @@
           <w:b/>
           <w:bCs/>
         </w:rPr>
-        <w:t xml:space="preserve">Tampilan Awal (Form Kosong):</w:t>
+        <w:lastRenderedPageBreak/>
+        <w:t>Tampilan Awal (Form Kosong):</w:t>
       </w:r>
       <w:r>
         <w:t xml:space="preserve"> </w:t>
       </w:r>
       <w:r>
+        <w:rPr>
+          <w:noProof/>
+        </w:rPr>
         <w:drawing>
-          <wp:inline>
+          <wp:inline distT="0" distB="0" distL="0" distR="0" wp14:anchorId="057D1F27" wp14:editId="2C20BE76">
             <wp:extent cx="5334000" cy="2602408"/>
-            <wp:effectExtent b="0" l="0" r="0" t="0"/>
-            <wp:docPr descr="Form Kosong" title="" id="23" name="Picture"/>
-            <a:graphic>
+            <wp:effectExtent l="0" t="0" r="0" b="0"/>
+            <wp:docPr id="23" name="Picture" descr="Form Kosong"/>
+            <wp:cNvGraphicFramePr/>
+            <a:graphic xmlns:a="http://schemas.openxmlformats.org/drawingml/2006/main">
               <a:graphicData uri="http://schemas.openxmlformats.org/drawingml/2006/picture">
-                <pic:pic>
+                <pic:pic xmlns:pic="http://schemas.openxmlformats.org/drawingml/2006/picture">
                   <pic:nvPicPr>
-                    <pic:cNvPr descr="screenshots/p14_form_empty.png" id="24" name="Picture"/>
+                    <pic:cNvPr id="24" name="Picture" descr="screenshots/p14_form_empty.png"/>
                     <pic:cNvPicPr>
-                      <a:picLocks noChangeArrowheads="1" noChangeAspect="1"/>
+                      <a:picLocks noChangeAspect="1" noChangeArrowheads="1"/>
                     </pic:cNvPicPr>
                   </pic:nvPicPr>
                   <pic:blipFill>
-                    <a:blip r:embed="rId22"/>
+                    <a:blip r:embed="rId7"/>
                     <a:stretch>
                       <a:fillRect/>
                     </a:stretch>
@@ -447,28 +610,32 @@
           <w:b/>
           <w:bCs/>
         </w:rPr>
-        <w:t xml:space="preserve">Tampilan Setelah Data Diinput:</w:t>
+        <w:t>Tampilan Setelah Data Diinput:</w:t>
       </w:r>
       <w:r>
         <w:t xml:space="preserve"> </w:t>
       </w:r>
       <w:r>
+        <w:rPr>
+          <w:noProof/>
+        </w:rPr>
         <w:drawing>
-          <wp:inline>
+          <wp:inline distT="0" distB="0" distL="0" distR="0" wp14:anchorId="7F377D8B" wp14:editId="0ED8450B">
             <wp:extent cx="5334000" cy="2602408"/>
-            <wp:effectExtent b="0" l="0" r="0" t="0"/>
-            <wp:docPr descr="Form Berisi Data" title="" id="26" name="Picture"/>
-            <a:graphic>
+            <wp:effectExtent l="0" t="0" r="0" b="0"/>
+            <wp:docPr id="26" name="Picture" descr="Form Berisi Data"/>
+            <wp:cNvGraphicFramePr/>
+            <a:graphic xmlns:a="http://schemas.openxmlformats.org/drawingml/2006/main">
               <a:graphicData uri="http://schemas.openxmlformats.org/drawingml/2006/picture">
-                <pic:pic>
+                <pic:pic xmlns:pic="http://schemas.openxmlformats.org/drawingml/2006/picture">
                   <pic:nvPicPr>
-                    <pic:cNvPr descr="screenshots/p14_form_filled.png" id="27" name="Picture"/>
+                    <pic:cNvPr id="27" name="Picture" descr="screenshots/p14_form_filled.png"/>
                     <pic:cNvPicPr>
-                      <a:picLocks noChangeArrowheads="1" noChangeAspect="1"/>
+                      <a:picLocks noChangeAspect="1" noChangeArrowheads="1"/>
                     </pic:cNvPicPr>
                   </pic:nvPicPr>
                   <pic:blipFill>
-                    <a:blip r:embed="rId25"/>
+                    <a:blip r:embed="rId8"/>
                     <a:stretch>
                       <a:fillRect/>
                     </a:stretch>
@@ -504,7 +671,7 @@
           <w:i/>
           <w:iCs/>
         </w:rPr>
-        <w:t xml:space="preserve">Cara Kerja Singkat Kode JS:</w:t>
+        <w:t>Cara Kerja Singkat Kode JS:</w:t>
       </w:r>
     </w:p>
     <w:p>
@@ -515,7 +682,7 @@
         <w:rPr>
           <w:rStyle w:val="KeywordTok"/>
         </w:rPr>
-        <w:t xml:space="preserve">let</w:t>
+        <w:t>let</w:t>
       </w:r>
       <w:r>
         <w:rPr>
@@ -527,7 +694,7 @@
         <w:rPr>
           <w:rStyle w:val="OperatorTok"/>
         </w:rPr>
-        <w:t xml:space="preserve">=</w:t>
+        <w:t>=</w:t>
       </w:r>
       <w:r>
         <w:rPr>
@@ -539,7 +706,7 @@
         <w:rPr>
           <w:rStyle w:val="OperatorTok"/>
         </w:rPr>
-        <w:t xml:space="preserve">;</w:t>
+        <w:t>;</w:t>
       </w:r>
       <w:r>
         <w:rPr>
@@ -551,7 +718,7 @@
         <w:rPr>
           <w:rStyle w:val="CommentTok"/>
         </w:rPr>
-        <w:t xml:space="preserve">// Inisialisasi array kosong</w:t>
+        <w:t>// Inisialisasi array kosong</w:t>
       </w:r>
       <w:r>
         <w:br/>
@@ -563,7 +730,7 @@
         <w:rPr>
           <w:rStyle w:val="KeywordTok"/>
         </w:rPr>
-        <w:t xml:space="preserve">function</w:t>
+        <w:t>function</w:t>
       </w:r>
       <w:r>
         <w:rPr>
@@ -575,13 +742,13 @@
         <w:rPr>
           <w:rStyle w:val="FunctionTok"/>
         </w:rPr>
-        <w:t xml:space="preserve">tambahData</w:t>
-      </w:r>
-      <w:r>
-        <w:rPr>
-          <w:rStyle w:val="NormalTok"/>
-        </w:rPr>
-        <w:t xml:space="preserve">() {</w:t>
+        <w:t>tambahData</w:t>
+      </w:r>
+      <w:r>
+        <w:rPr>
+          <w:rStyle w:val="NormalTok"/>
+        </w:rPr>
+        <w:t>() {</w:t>
       </w:r>
       <w:r>
         <w:br/>
@@ -596,7 +763,7 @@
         <w:rPr>
           <w:rStyle w:val="CommentTok"/>
         </w:rPr>
-        <w:t xml:space="preserve">// Ambil data dari elemen input berdasarkan ID</w:t>
+        <w:t>// Ambil data dari elemen input berdasarkan ID</w:t>
       </w:r>
       <w:r>
         <w:br/>
@@ -611,7 +778,7 @@
         <w:rPr>
           <w:rStyle w:val="KeywordTok"/>
         </w:rPr>
-        <w:t xml:space="preserve">let</w:t>
+        <w:t>let</w:t>
       </w:r>
       <w:r>
         <w:rPr>
@@ -623,7 +790,7 @@
         <w:rPr>
           <w:rStyle w:val="OperatorTok"/>
         </w:rPr>
-        <w:t xml:space="preserve">=</w:t>
+        <w:t>=</w:t>
       </w:r>
       <w:r>
         <w:rPr>
@@ -635,55 +802,55 @@
         <w:rPr>
           <w:rStyle w:val="BuiltInTok"/>
         </w:rPr>
-        <w:t xml:space="preserve">document</w:t>
+        <w:t>document</w:t>
       </w:r>
       <w:r>
         <w:rPr>
           <w:rStyle w:val="OperatorTok"/>
         </w:rPr>
-        <w:t xml:space="preserve">.</w:t>
+        <w:t>.</w:t>
       </w:r>
       <w:r>
         <w:rPr>
           <w:rStyle w:val="FunctionTok"/>
         </w:rPr>
-        <w:t xml:space="preserve">getElementById</w:t>
-      </w:r>
-      <w:r>
-        <w:rPr>
-          <w:rStyle w:val="NormalTok"/>
-        </w:rPr>
-        <w:t xml:space="preserve">(</w:t>
+        <w:t>getElementById</w:t>
+      </w:r>
+      <w:r>
+        <w:rPr>
+          <w:rStyle w:val="NormalTok"/>
+        </w:rPr>
+        <w:t>(</w:t>
       </w:r>
       <w:r>
         <w:rPr>
           <w:rStyle w:val="StringTok"/>
         </w:rPr>
-        <w:t xml:space="preserve">"nim"</w:t>
-      </w:r>
-      <w:r>
-        <w:rPr>
-          <w:rStyle w:val="NormalTok"/>
-        </w:rPr>
-        <w:t xml:space="preserve">)</w:t>
+        <w:t>"nim"</w:t>
+      </w:r>
+      <w:r>
+        <w:rPr>
+          <w:rStyle w:val="NormalTok"/>
+        </w:rPr>
+        <w:t>)</w:t>
       </w:r>
       <w:r>
         <w:rPr>
           <w:rStyle w:val="OperatorTok"/>
         </w:rPr>
-        <w:t xml:space="preserve">.</w:t>
+        <w:t>.</w:t>
       </w:r>
       <w:r>
         <w:rPr>
           <w:rStyle w:val="AttributeTok"/>
         </w:rPr>
-        <w:t xml:space="preserve">value</w:t>
+        <w:t>value</w:t>
       </w:r>
       <w:r>
         <w:rPr>
           <w:rStyle w:val="OperatorTok"/>
         </w:rPr>
-        <w:t xml:space="preserve">;</w:t>
+        <w:t>;</w:t>
       </w:r>
       <w:r>
         <w:br/>
@@ -698,7 +865,7 @@
         <w:rPr>
           <w:rStyle w:val="KeywordTok"/>
         </w:rPr>
-        <w:t xml:space="preserve">let</w:t>
+        <w:t>let</w:t>
       </w:r>
       <w:r>
         <w:rPr>
@@ -710,7 +877,7 @@
         <w:rPr>
           <w:rStyle w:val="OperatorTok"/>
         </w:rPr>
-        <w:t xml:space="preserve">=</w:t>
+        <w:t>=</w:t>
       </w:r>
       <w:r>
         <w:rPr>
@@ -722,55 +889,55 @@
         <w:rPr>
           <w:rStyle w:val="BuiltInTok"/>
         </w:rPr>
-        <w:t xml:space="preserve">document</w:t>
+        <w:t>document</w:t>
       </w:r>
       <w:r>
         <w:rPr>
           <w:rStyle w:val="OperatorTok"/>
         </w:rPr>
-        <w:t xml:space="preserve">.</w:t>
+        <w:t>.</w:t>
       </w:r>
       <w:r>
         <w:rPr>
           <w:rStyle w:val="FunctionTok"/>
         </w:rPr>
-        <w:t xml:space="preserve">getElementById</w:t>
-      </w:r>
-      <w:r>
-        <w:rPr>
-          <w:rStyle w:val="NormalTok"/>
-        </w:rPr>
-        <w:t xml:space="preserve">(</w:t>
+        <w:t>getElementById</w:t>
+      </w:r>
+      <w:r>
+        <w:rPr>
+          <w:rStyle w:val="NormalTok"/>
+        </w:rPr>
+        <w:t>(</w:t>
       </w:r>
       <w:r>
         <w:rPr>
           <w:rStyle w:val="StringTok"/>
         </w:rPr>
-        <w:t xml:space="preserve">"nama"</w:t>
-      </w:r>
-      <w:r>
-        <w:rPr>
-          <w:rStyle w:val="NormalTok"/>
-        </w:rPr>
-        <w:t xml:space="preserve">)</w:t>
+        <w:t>"nama"</w:t>
+      </w:r>
+      <w:r>
+        <w:rPr>
+          <w:rStyle w:val="NormalTok"/>
+        </w:rPr>
+        <w:t>)</w:t>
       </w:r>
       <w:r>
         <w:rPr>
           <w:rStyle w:val="OperatorTok"/>
         </w:rPr>
-        <w:t xml:space="preserve">.</w:t>
+        <w:t>.</w:t>
       </w:r>
       <w:r>
         <w:rPr>
           <w:rStyle w:val="AttributeTok"/>
         </w:rPr>
-        <w:t xml:space="preserve">value</w:t>
+        <w:t>value</w:t>
       </w:r>
       <w:r>
         <w:rPr>
           <w:rStyle w:val="OperatorTok"/>
         </w:rPr>
-        <w:t xml:space="preserve">;</w:t>
+        <w:t>;</w:t>
       </w:r>
       <w:r>
         <w:br/>
@@ -785,7 +952,7 @@
         <w:rPr>
           <w:rStyle w:val="CommentTok"/>
         </w:rPr>
-        <w:t xml:space="preserve">// ... dst</w:t>
+        <w:t>// ... dst</w:t>
       </w:r>
       <w:r>
         <w:br/>
@@ -809,7 +976,7 @@
         <w:rPr>
           <w:rStyle w:val="CommentTok"/>
         </w:rPr>
-        <w:t xml:space="preserve">// Buat objek mahasiswa baru</w:t>
+        <w:t>// Buat objek mahasiswa baru</w:t>
       </w:r>
       <w:r>
         <w:br/>
@@ -824,7 +991,7 @@
         <w:rPr>
           <w:rStyle w:val="KeywordTok"/>
         </w:rPr>
-        <w:t xml:space="preserve">let</w:t>
+        <w:t>let</w:t>
       </w:r>
       <w:r>
         <w:rPr>
@@ -836,7 +1003,7 @@
         <w:rPr>
           <w:rStyle w:val="OperatorTok"/>
         </w:rPr>
-        <w:t xml:space="preserve">=</w:t>
+        <w:t>=</w:t>
       </w:r>
       <w:r>
         <w:rPr>
@@ -848,13 +1015,13 @@
         <w:rPr>
           <w:rStyle w:val="DataTypeTok"/>
         </w:rPr>
-        <w:t xml:space="preserve">nim</w:t>
+        <w:t>nim</w:t>
       </w:r>
       <w:r>
         <w:rPr>
           <w:rStyle w:val="OperatorTok"/>
         </w:rPr>
-        <w:t xml:space="preserve">:</w:t>
+        <w:t>:</w:t>
       </w:r>
       <w:r>
         <w:rPr>
@@ -866,7 +1033,7 @@
         <w:rPr>
           <w:rStyle w:val="OperatorTok"/>
         </w:rPr>
-        <w:t xml:space="preserve">,</w:t>
+        <w:t>,</w:t>
       </w:r>
       <w:r>
         <w:rPr>
@@ -878,13 +1045,13 @@
         <w:rPr>
           <w:rStyle w:val="DataTypeTok"/>
         </w:rPr>
-        <w:t xml:space="preserve">nama</w:t>
+        <w:t>nama</w:t>
       </w:r>
       <w:r>
         <w:rPr>
           <w:rStyle w:val="OperatorTok"/>
         </w:rPr>
-        <w:t xml:space="preserve">:</w:t>
+        <w:t>:</w:t>
       </w:r>
       <w:r>
         <w:rPr>
@@ -896,7 +1063,7 @@
         <w:rPr>
           <w:rStyle w:val="OperatorTok"/>
         </w:rPr>
-        <w:t xml:space="preserve">,</w:t>
+        <w:t>,</w:t>
       </w:r>
       <w:r>
         <w:rPr>
@@ -908,13 +1075,13 @@
         <w:rPr>
           <w:rStyle w:val="DataTypeTok"/>
         </w:rPr>
-        <w:t xml:space="preserve">jurusan</w:t>
+        <w:t>jurusan</w:t>
       </w:r>
       <w:r>
         <w:rPr>
           <w:rStyle w:val="OperatorTok"/>
         </w:rPr>
-        <w:t xml:space="preserve">:</w:t>
+        <w:t>:</w:t>
       </w:r>
       <w:r>
         <w:rPr>
@@ -926,7 +1093,7 @@
         <w:rPr>
           <w:rStyle w:val="OperatorTok"/>
         </w:rPr>
-        <w:t xml:space="preserve">,</w:t>
+        <w:t>,</w:t>
       </w:r>
       <w:r>
         <w:rPr>
@@ -938,13 +1105,13 @@
         <w:rPr>
           <w:rStyle w:val="DataTypeTok"/>
         </w:rPr>
-        <w:t xml:space="preserve">fakultas</w:t>
+        <w:t>fakultas</w:t>
       </w:r>
       <w:r>
         <w:rPr>
           <w:rStyle w:val="OperatorTok"/>
         </w:rPr>
-        <w:t xml:space="preserve">:</w:t>
+        <w:t>:</w:t>
       </w:r>
       <w:r>
         <w:rPr>
@@ -956,7 +1123,7 @@
         <w:rPr>
           <w:rStyle w:val="OperatorTok"/>
         </w:rPr>
-        <w:t xml:space="preserve">;</w:t>
+        <w:t>;</w:t>
       </w:r>
       <w:r>
         <w:br/>
@@ -974,13 +1141,14 @@
         <w:rPr>
           <w:rStyle w:val="NormalTok"/>
         </w:rPr>
+        <w:lastRenderedPageBreak/>
         <w:t xml:space="preserve">    </w:t>
       </w:r>
       <w:r>
         <w:rPr>
           <w:rStyle w:val="CommentTok"/>
         </w:rPr>
-        <w:t xml:space="preserve">// Masukkan ke array</w:t>
+        <w:t>// Masukkan ke array</w:t>
       </w:r>
       <w:r>
         <w:br/>
@@ -995,25 +1163,25 @@
         <w:rPr>
           <w:rStyle w:val="OperatorTok"/>
         </w:rPr>
-        <w:t xml:space="preserve">.</w:t>
+        <w:t>.</w:t>
       </w:r>
       <w:r>
         <w:rPr>
           <w:rStyle w:val="FunctionTok"/>
         </w:rPr>
-        <w:t xml:space="preserve">push</w:t>
-      </w:r>
-      <w:r>
-        <w:rPr>
-          <w:rStyle w:val="NormalTok"/>
-        </w:rPr>
-        <w:t xml:space="preserve">(mahasiswa)</w:t>
+        <w:t>push</w:t>
+      </w:r>
+      <w:r>
+        <w:rPr>
+          <w:rStyle w:val="NormalTok"/>
+        </w:rPr>
+        <w:t>(mahasiswa)</w:t>
       </w:r>
       <w:r>
         <w:rPr>
           <w:rStyle w:val="OperatorTok"/>
         </w:rPr>
-        <w:t xml:space="preserve">;</w:t>
+        <w:t>;</w:t>
       </w:r>
       <w:r>
         <w:br/>
@@ -1028,19 +1196,19 @@
         <w:rPr>
           <w:rStyle w:val="FunctionTok"/>
         </w:rPr>
-        <w:t xml:space="preserve">tampilkanData</w:t>
-      </w:r>
-      <w:r>
-        <w:rPr>
-          <w:rStyle w:val="NormalTok"/>
-        </w:rPr>
-        <w:t xml:space="preserve">()</w:t>
+        <w:t>tampilkanData</w:t>
+      </w:r>
+      <w:r>
+        <w:rPr>
+          <w:rStyle w:val="NormalTok"/>
+        </w:rPr>
+        <w:t>()</w:t>
       </w:r>
       <w:r>
         <w:rPr>
           <w:rStyle w:val="OperatorTok"/>
         </w:rPr>
-        <w:t xml:space="preserve">;</w:t>
+        <w:t>;</w:t>
       </w:r>
       <w:r>
         <w:rPr>
@@ -1052,7 +1220,7 @@
         <w:rPr>
           <w:rStyle w:val="CommentTok"/>
         </w:rPr>
-        <w:t xml:space="preserve">// Panggil fungsi re-render tabel</w:t>
+        <w:t>// Panggil fungsi re-render tabel</w:t>
       </w:r>
       <w:r>
         <w:br/>
@@ -1061,33 +1229,33 @@
         <w:rPr>
           <w:rStyle w:val="NormalTok"/>
         </w:rPr>
-        <w:t xml:space="preserve">}</w:t>
-      </w:r>
-    </w:p>
-    <w:p>
-      <w:r>
-        <w:pict>
-          <v:rect style="width:0;height:1.5pt" o:hralign="center" o:hrstd="t" o:hr="t"/>
+        <w:t>}</w:t>
+      </w:r>
+    </w:p>
+    <w:p>
+      <w:r>
+        <w:pict w14:anchorId="19DD811A">
+          <v:rect id="_x0000_i1028" style="width:0;height:1.5pt" o:hralign="center" o:hrstd="t" o:hr="t"/>
         </w:pict>
       </w:r>
     </w:p>
-    <w:bookmarkEnd w:id="28"/>
-    <w:bookmarkStart w:id="32" w:name="tipe-data-array-js_array.html"/>
     <w:p>
       <w:pPr>
         <w:pStyle w:val="Heading3"/>
       </w:pPr>
-      <w:r>
-        <w:t xml:space="preserve">3.2 Tipe Data Array (</w:t>
+      <w:bookmarkStart w:id="5" w:name="tipe-data-array-js_array.html"/>
+      <w:bookmarkEnd w:id="4"/>
+      <w:r>
+        <w:t>3.2 Tipe Data Array (</w:t>
       </w:r>
       <w:r>
         <w:rPr>
           <w:rStyle w:val="VerbatimChar"/>
         </w:rPr>
-        <w:t xml:space="preserve">js_array.html</w:t>
-      </w:r>
-      <w:r>
-        <w:t xml:space="preserve">)</w:t>
+        <w:t>js_array.html</w:t>
+      </w:r>
+      <w:r>
+        <w:t>)</w:t>
       </w:r>
     </w:p>
     <w:p>
@@ -1095,7 +1263,7 @@
         <w:pStyle w:val="FirstParagraph"/>
       </w:pPr>
       <w:r>
-        <w:t xml:space="preserve">File ini difokuskan pada pembelajaran Array. Array adalah struktur data yang menyimpan satu atau lebih nilai ke dalam sebuah variabel tunggal.</w:t>
+        <w:t>File ini difokuskan pada pembelajaran Array. Array adalah struktur data yang menyimpan satu atau lebih nilai ke dalam sebuah variabel tunggal.</w:t>
       </w:r>
     </w:p>
     <w:p>
@@ -1107,23 +1275,17 @@
           <w:i/>
           <w:iCs/>
         </w:rPr>
-        <w:t xml:space="preserve">Penjelasan Kode:</w:t>
-      </w:r>
-      <w:r>
-        <w:t xml:space="preserve"> </w:t>
-      </w:r>
-      <w:r>
-        <w:t xml:space="preserve">Program ini mendeklarasikan Array</w:t>
-      </w:r>
-      <w:r>
-        <w:t xml:space="preserve"> </w:t>
+        <w:t>Penjelasan Kode:</w:t>
+      </w:r>
+      <w:r>
+        <w:t xml:space="preserve"> Program ini mendeklarasikan Array </w:t>
       </w:r>
       <w:r>
         <w:rPr>
           <w:i/>
           <w:iCs/>
         </w:rPr>
-        <w:t xml:space="preserve">number</w:t>
+        <w:t>number</w:t>
       </w:r>
       <w:r>
         <w:t xml:space="preserve"> </w:t>
@@ -1132,20 +1294,17 @@
         <w:rPr>
           <w:rStyle w:val="VerbatimChar"/>
         </w:rPr>
-        <w:t xml:space="preserve">[1, 2, 3, 4, 5]</w:t>
-      </w:r>
-      <w:r>
-        <w:t xml:space="preserve">, Array</w:t>
-      </w:r>
-      <w:r>
-        <w:t xml:space="preserve"> </w:t>
+        <w:t>[1, 2, 3, 4, 5]</w:t>
+      </w:r>
+      <w:r>
+        <w:t xml:space="preserve">, Array </w:t>
       </w:r>
       <w:r>
         <w:rPr>
           <w:i/>
           <w:iCs/>
         </w:rPr>
-        <w:t xml:space="preserve">string</w:t>
+        <w:t>string</w:t>
       </w:r>
       <w:r>
         <w:t xml:space="preserve"> </w:t>
@@ -1154,78 +1313,57 @@
         <w:rPr>
           <w:rStyle w:val="VerbatimChar"/>
         </w:rPr>
-        <w:t xml:space="preserve">["a", "b", "c", "d", "e"]</w:t>
-      </w:r>
-      <w:r>
-        <w:t xml:space="preserve">, dan Array</w:t>
-      </w:r>
-      <w:r>
-        <w:t xml:space="preserve"> </w:t>
+        <w:t>["a", "b", "c", "d", "e"]</w:t>
+      </w:r>
+      <w:r>
+        <w:t xml:space="preserve">, dan Array </w:t>
       </w:r>
       <w:r>
         <w:rPr>
           <w:i/>
           <w:iCs/>
         </w:rPr>
-        <w:t xml:space="preserve">mix</w:t>
-      </w:r>
-      <w:r>
-        <w:t xml:space="preserve"> </w:t>
-      </w:r>
-      <w:r>
-        <w:t xml:space="preserve">(campuran tipe data). Kode juga menampilkan akses elemen array melalui</w:t>
-      </w:r>
-      <w:r>
-        <w:t xml:space="preserve"> </w:t>
+        <w:t>mix</w:t>
+      </w:r>
+      <w:r>
+        <w:t xml:space="preserve"> (campuran tipe data). Kode juga menampilkan akses elemen array melalui </w:t>
       </w:r>
       <w:r>
         <w:rPr>
           <w:i/>
           <w:iCs/>
         </w:rPr>
-        <w:t xml:space="preserve">index</w:t>
-      </w:r>
-      <w:r>
-        <w:t xml:space="preserve"> </w:t>
-      </w:r>
-      <w:r>
-        <w:t xml:space="preserve">(dimulai dari</w:t>
-      </w:r>
-      <w:r>
-        <w:t xml:space="preserve"> </w:t>
+        <w:t>index</w:t>
+      </w:r>
+      <w:r>
+        <w:t xml:space="preserve"> (dimulai dari </w:t>
       </w:r>
       <w:r>
         <w:rPr>
           <w:rStyle w:val="VerbatimChar"/>
         </w:rPr>
-        <w:t xml:space="preserve">0</w:t>
-      </w:r>
-      <w:r>
-        <w:t xml:space="preserve">) dan perhitungan panjang elemen menggunakan</w:t>
-      </w:r>
-      <w:r>
-        <w:t xml:space="preserve"> </w:t>
+        <w:t>0</w:t>
+      </w:r>
+      <w:r>
+        <w:t xml:space="preserve">) dan perhitungan panjang elemen menggunakan </w:t>
       </w:r>
       <w:r>
         <w:rPr>
           <w:rStyle w:val="VerbatimChar"/>
         </w:rPr>
-        <w:t xml:space="preserve">.length</w:t>
-      </w:r>
-      <w:r>
-        <w:t xml:space="preserve">, lalu menampilkannya menggunakan perulangan</w:t>
-      </w:r>
-      <w:r>
-        <w:t xml:space="preserve"> </w:t>
+        <w:t>.length</w:t>
+      </w:r>
+      <w:r>
+        <w:t xml:space="preserve">, lalu menampilkannya menggunakan perulangan </w:t>
       </w:r>
       <w:r>
         <w:rPr>
           <w:rStyle w:val="VerbatimChar"/>
         </w:rPr>
-        <w:t xml:space="preserve">for</w:t>
-      </w:r>
-      <w:r>
-        <w:t xml:space="preserve">.</w:t>
+        <w:t>for</w:t>
+      </w:r>
+      <w:r>
+        <w:t>.</w:t>
       </w:r>
     </w:p>
     <w:p>
@@ -1237,28 +1375,32 @@
           <w:b/>
           <w:bCs/>
         </w:rPr>
-        <w:t xml:space="preserve">Output di Browser / Console:</w:t>
+        <w:t>Output di Browser / Console:</w:t>
       </w:r>
       <w:r>
         <w:t xml:space="preserve"> </w:t>
       </w:r>
       <w:r>
+        <w:rPr>
+          <w:noProof/>
+        </w:rPr>
         <w:drawing>
-          <wp:inline>
+          <wp:inline distT="0" distB="0" distL="0" distR="0" wp14:anchorId="61AE8E92" wp14:editId="00A065DD">
             <wp:extent cx="5334000" cy="2602408"/>
-            <wp:effectExtent b="0" l="0" r="0" t="0"/>
-            <wp:docPr descr="Console JS Array" title="" id="30" name="Picture"/>
-            <a:graphic>
+            <wp:effectExtent l="0" t="0" r="0" b="0"/>
+            <wp:docPr id="30" name="Picture" descr="Console JS Array"/>
+            <wp:cNvGraphicFramePr/>
+            <a:graphic xmlns:a="http://schemas.openxmlformats.org/drawingml/2006/main">
               <a:graphicData uri="http://schemas.openxmlformats.org/drawingml/2006/picture">
-                <pic:pic>
+                <pic:pic xmlns:pic="http://schemas.openxmlformats.org/drawingml/2006/picture">
                   <pic:nvPicPr>
-                    <pic:cNvPr descr="screenshots/p14_array.png" id="31" name="Picture"/>
+                    <pic:cNvPr id="31" name="Picture" descr="screenshots/p14_array.png"/>
                     <pic:cNvPicPr>
-                      <a:picLocks noChangeArrowheads="1" noChangeAspect="1"/>
+                      <a:picLocks noChangeAspect="1" noChangeArrowheads="1"/>
                     </pic:cNvPicPr>
                   </pic:nvPicPr>
                   <pic:blipFill>
-                    <a:blip r:embed="rId29"/>
+                    <a:blip r:embed="rId9"/>
                     <a:stretch>
                       <a:fillRect/>
                     </a:stretch>
@@ -1287,28 +1429,28 @@
     </w:p>
     <w:p>
       <w:r>
-        <w:pict>
-          <v:rect style="width:0;height:1.5pt" o:hralign="center" o:hrstd="t" o:hr="t"/>
+        <w:pict w14:anchorId="24707533">
+          <v:rect id="_x0000_i1029" style="width:0;height:1.5pt" o:hralign="center" o:hrstd="t" o:hr="t"/>
         </w:pict>
       </w:r>
     </w:p>
-    <w:bookmarkEnd w:id="32"/>
-    <w:bookmarkStart w:id="36" w:name="tipe-data-object-js_object.html"/>
     <w:p>
       <w:pPr>
         <w:pStyle w:val="Heading3"/>
       </w:pPr>
-      <w:r>
-        <w:t xml:space="preserve">3.3 Tipe Data Object (</w:t>
+      <w:bookmarkStart w:id="6" w:name="tipe-data-object-js_object.html"/>
+      <w:bookmarkEnd w:id="5"/>
+      <w:r>
+        <w:t>3.3 Tipe Data Object (</w:t>
       </w:r>
       <w:r>
         <w:rPr>
           <w:rStyle w:val="VerbatimChar"/>
         </w:rPr>
-        <w:t xml:space="preserve">js_object.html</w:t>
-      </w:r>
-      <w:r>
-        <w:t xml:space="preserve">)</w:t>
+        <w:t>js_object.html</w:t>
+      </w:r>
+      <w:r>
+        <w:t>)</w:t>
       </w:r>
     </w:p>
     <w:p>
@@ -1316,23 +1458,17 @@
         <w:pStyle w:val="FirstParagraph"/>
       </w:pPr>
       <w:r>
-        <w:t xml:space="preserve">File ini difokuskan pada pembelajaran Object. Objek di JavaScript memungkinkan penyimpanan data dalam bentuk</w:t>
-      </w:r>
-      <w:r>
-        <w:t xml:space="preserve"> </w:t>
+        <w:t xml:space="preserve">File ini difokuskan pada pembelajaran Object. Objek di JavaScript memungkinkan penyimpanan data dalam bentuk </w:t>
       </w:r>
       <w:r>
         <w:rPr>
           <w:i/>
           <w:iCs/>
         </w:rPr>
-        <w:t xml:space="preserve">Key-Value Pair</w:t>
-      </w:r>
-      <w:r>
-        <w:t xml:space="preserve"> </w:t>
-      </w:r>
-      <w:r>
-        <w:t xml:space="preserve">(pasangan kunci-nilai), sehingga datanya jauh lebih representatif dan mudah dipahami konteksnya dibandingkan menggunakan indeks numerik.</w:t>
+        <w:t>Key-Value Pair</w:t>
+      </w:r>
+      <w:r>
+        <w:t xml:space="preserve"> (pasangan kunci-nilai), sehingga datanya jauh lebih representatif dan mudah dipahami konteksnya dibandingkan menggunakan indeks numerik.</w:t>
       </w:r>
     </w:p>
     <w:p>
@@ -1344,90 +1480,57 @@
           <w:i/>
           <w:iCs/>
         </w:rPr>
-        <w:t xml:space="preserve">Penjelasan Kode:</w:t>
-      </w:r>
-      <w:r>
-        <w:t xml:space="preserve"> </w:t>
-      </w:r>
-      <w:r>
-        <w:t xml:space="preserve">Kode mensimulasikan satu entitas objek</w:t>
-      </w:r>
-      <w:r>
-        <w:t xml:space="preserve"> </w:t>
+        <w:t>Penjelasan Kode:</w:t>
+      </w:r>
+      <w:r>
+        <w:t xml:space="preserve"> Kode mensimulasikan satu entitas objek </w:t>
       </w:r>
       <w:r>
         <w:rPr>
           <w:rStyle w:val="VerbatimChar"/>
         </w:rPr>
-        <w:t xml:space="preserve">mahasiswa</w:t>
-      </w:r>
-      <w:r>
-        <w:t xml:space="preserve"> </w:t>
-      </w:r>
-      <w:r>
-        <w:t xml:space="preserve">biasa, kemudian membuat struktur</w:t>
-      </w:r>
-      <w:r>
-        <w:t xml:space="preserve"> </w:t>
+        <w:t>mahasiswa</w:t>
+      </w:r>
+      <w:r>
+        <w:t xml:space="preserve"> biasa, kemudian membuat struktur </w:t>
       </w:r>
       <w:r>
         <w:rPr>
           <w:rStyle w:val="VerbatimChar"/>
         </w:rPr>
-        <w:t xml:space="preserve">dataMahasiswa</w:t>
-      </w:r>
-      <w:r>
-        <w:t xml:space="preserve"> </w:t>
-      </w:r>
-      <w:r>
-        <w:t xml:space="preserve">yang merupakan</w:t>
-      </w:r>
-      <w:r>
-        <w:t xml:space="preserve"> </w:t>
+        <w:t>dataMahasiswa</w:t>
+      </w:r>
+      <w:r>
+        <w:t xml:space="preserve"> yang merupakan </w:t>
       </w:r>
       <w:r>
         <w:rPr>
           <w:b/>
           <w:bCs/>
         </w:rPr>
-        <w:t xml:space="preserve">Array of Object</w:t>
-      </w:r>
-      <w:r>
-        <w:t xml:space="preserve"> </w:t>
-      </w:r>
-      <w:r>
-        <w:t xml:space="preserve">(Array yang setiap elemennya berisi Objek). Program kemudian mendemonstrasikan perulangan menggunakan struktur</w:t>
-      </w:r>
-      <w:r>
-        <w:t xml:space="preserve"> </w:t>
+        <w:t>Array of Object</w:t>
+      </w:r>
+      <w:r>
+        <w:t xml:space="preserve"> (Array yang setiap elemennya berisi Objek). Program kemudian mendemonstrasikan perulangan menggunakan struktur </w:t>
       </w:r>
       <w:r>
         <w:rPr>
           <w:rStyle w:val="VerbatimChar"/>
         </w:rPr>
-        <w:t xml:space="preserve">for...in</w:t>
-      </w:r>
-      <w:r>
-        <w:t xml:space="preserve"> </w:t>
-      </w:r>
-      <w:r>
-        <w:t xml:space="preserve">untuk mengambil nilai dari dalam</w:t>
-      </w:r>
-      <w:r>
-        <w:t xml:space="preserve"> </w:t>
+        <w:t>for...in</w:t>
+      </w:r>
+      <w:r>
+        <w:t xml:space="preserve"> untuk mengambil nilai dari dalam </w:t>
       </w:r>
       <w:r>
         <w:rPr>
           <w:i/>
           <w:iCs/>
         </w:rPr>
-        <w:t xml:space="preserve">property</w:t>
-      </w:r>
-      <w:r>
-        <w:t xml:space="preserve"> </w:t>
-      </w:r>
-      <w:r>
-        <w:t xml:space="preserve">objek.</w:t>
+        <w:t>property</w:t>
+      </w:r>
+      <w:r>
+        <w:t xml:space="preserve"> objek.</w:t>
       </w:r>
     </w:p>
     <w:p>
@@ -1439,28 +1542,33 @@
           <w:b/>
           <w:bCs/>
         </w:rPr>
-        <w:t xml:space="preserve">Output di Browser / Console:</w:t>
+        <w:lastRenderedPageBreak/>
+        <w:t>Output di Browser / Console:</w:t>
       </w:r>
       <w:r>
         <w:t xml:space="preserve"> </w:t>
       </w:r>
       <w:r>
+        <w:rPr>
+          <w:noProof/>
+        </w:rPr>
         <w:drawing>
-          <wp:inline>
+          <wp:inline distT="0" distB="0" distL="0" distR="0" wp14:anchorId="094CFBED" wp14:editId="69695C45">
             <wp:extent cx="5334000" cy="2602408"/>
-            <wp:effectExtent b="0" l="0" r="0" t="0"/>
-            <wp:docPr descr="Console JS Object" title="" id="34" name="Picture"/>
-            <a:graphic>
+            <wp:effectExtent l="0" t="0" r="0" b="0"/>
+            <wp:docPr id="34" name="Picture" descr="Console JS Object"/>
+            <wp:cNvGraphicFramePr/>
+            <a:graphic xmlns:a="http://schemas.openxmlformats.org/drawingml/2006/main">
               <a:graphicData uri="http://schemas.openxmlformats.org/drawingml/2006/picture">
-                <pic:pic>
+                <pic:pic xmlns:pic="http://schemas.openxmlformats.org/drawingml/2006/picture">
                   <pic:nvPicPr>
-                    <pic:cNvPr descr="screenshots/p14_object.png" id="35" name="Picture"/>
+                    <pic:cNvPr id="35" name="Picture" descr="screenshots/p14_object.png"/>
                     <pic:cNvPicPr>
-                      <a:picLocks noChangeArrowheads="1" noChangeAspect="1"/>
+                      <a:picLocks noChangeAspect="1" noChangeArrowheads="1"/>
                     </pic:cNvPicPr>
                   </pic:nvPicPr>
                   <pic:blipFill>
-                    <a:blip r:embed="rId33"/>
+                    <a:blip r:embed="rId10"/>
                     <a:stretch>
                       <a:fillRect/>
                     </a:stretch>
@@ -1489,20 +1597,20 @@
     </w:p>
     <w:p>
       <w:r>
-        <w:pict>
-          <v:rect style="width:0;height:1.5pt" o:hralign="center" o:hrstd="t" o:hr="t"/>
+        <w:pict w14:anchorId="0A05A8DC">
+          <v:rect id="_x0000_i1030" style="width:0;height:1.5pt" o:hralign="center" o:hrstd="t" o:hr="t"/>
         </w:pict>
       </w:r>
     </w:p>
-    <w:bookmarkEnd w:id="36"/>
-    <w:bookmarkEnd w:id="37"/>
-    <w:bookmarkStart w:id="38" w:name="kesimpulan"/>
     <w:p>
       <w:pPr>
         <w:pStyle w:val="Heading2"/>
       </w:pPr>
-      <w:r>
-        <w:t xml:space="preserve">4. Kesimpulan</w:t>
+      <w:bookmarkStart w:id="7" w:name="kesimpulan"/>
+      <w:bookmarkEnd w:id="3"/>
+      <w:bookmarkEnd w:id="6"/>
+      <w:r>
+        <w:t>4. Kesimpulan</w:t>
       </w:r>
     </w:p>
     <w:p>
@@ -1510,59 +1618,78 @@
         <w:pStyle w:val="FirstParagraph"/>
       </w:pPr>
       <w:r>
-        <w:t xml:space="preserve">Melalui latihan Pertemuan 14 ini, pemahaman terhadap konsep dasar tipe data majemuk di JavaScript (Array dan Object) berhasil diterapkan. Selain itu, cara mengakses elemen HTML (</w:t>
+        <w:t>Melalui latihan Pertemuan 14 ini, pemahaman terhadap konsep dasar tipe data majemuk di JavaScript (Array dan Object) berhasil diterapkan. Selain itu, cara mengakses elemen HTML (</w:t>
       </w:r>
       <w:r>
         <w:rPr>
           <w:i/>
           <w:iCs/>
         </w:rPr>
-        <w:t xml:space="preserve">DOM Manipulation</w:t>
-      </w:r>
-      <w:r>
-        <w:t xml:space="preserve">) secara dinamis terbukti mampu membangun fitur interaktif meskipun tidak ada</w:t>
-      </w:r>
-      <w:r>
-        <w:t xml:space="preserve"> </w:t>
+        <w:t>DOM Manipulation</w:t>
+      </w:r>
+      <w:r>
+        <w:t xml:space="preserve">) secara dinamis terbukti mampu membangun fitur interaktif meskipun tidak ada </w:t>
       </w:r>
       <w:r>
         <w:rPr>
           <w:i/>
           <w:iCs/>
         </w:rPr>
-        <w:t xml:space="preserve">backend server</w:t>
-      </w:r>
-      <w:r>
-        <w:t xml:space="preserve"> </w:t>
-      </w:r>
-      <w:r>
-        <w:t xml:space="preserve">yang berjalan di belakang layar.</w:t>
-      </w:r>
-    </w:p>
-    <w:bookmarkEnd w:id="38"/>
-    <w:bookmarkEnd w:id="39"/>
-    <w:sectPr/>
+        <w:t>backend server</w:t>
+      </w:r>
+      <w:r>
+        <w:t xml:space="preserve"> yang berjalan di belakang layar.</w:t>
+      </w:r>
+      <w:bookmarkEnd w:id="0"/>
+      <w:bookmarkEnd w:id="7"/>
+    </w:p>
+    <w:sectPr>
+      <w:pgSz w:w="12240" w:h="15840"/>
+      <w:pgMar w:top="1440" w:right="1440" w:bottom="1440" w:left="1440" w:header="720" w:footer="720" w:gutter="0"/>
+      <w:cols w:space="720"/>
+    </w:sectPr>
   </w:body>
 </w:document>
 </file>
 
-<file path=word/comments.xml><?xml version="1.0" encoding="utf-8"?>
-<w:comments xmlns:w="http://schemas.openxmlformats.org/wordprocessingml/2006/main" xmlns:m="http://schemas.openxmlformats.org/officeDocument/2006/math" xmlns:r="http://schemas.openxmlformats.org/officeDocument/2006/relationships" xmlns:o="urn:schemas-microsoft-com:office:office" xmlns:v="urn:schemas-microsoft-com:vml" xmlns:w10="urn:schemas-microsoft-com:office:word" xmlns:a="http://schemas.openxmlformats.org/drawingml/2006/main" xmlns:pic="http://schemas.openxmlformats.org/drawingml/2006/picture" xmlns:wp="http://schemas.openxmlformats.org/drawingml/2006/wordprocessingDrawing"/>
+<file path=word/endnotes.xml><?xml version="1.0" encoding="utf-8"?>
+<w:endnotes xmlns:wpc="http://schemas.microsoft.com/office/word/2010/wordprocessingCanvas" xmlns:cx="http://schemas.microsoft.com/office/drawing/2014/chartex" xmlns:cx1="http://schemas.microsoft.com/office/drawing/2015/9/8/chartex" xmlns:cx2="http://schemas.microsoft.com/office/drawing/2015/10/21/chartex" xmlns:cx3="http://schemas.microsoft.com/office/drawing/2016/5/9/chartex" xmlns:cx4="http://schemas.microsoft.com/office/drawing/2016/5/10/chartex" xmlns:cx5="http://schemas.microsoft.com/office/drawing/2016/5/11/chartex" xmlns:cx6="http://schemas.microsoft.com/office/drawing/2016/5/12/chartex" xmlns:cx7="http://schemas.microsoft.com/office/drawing/2016/5/13/chartex" xmlns:cx8="http://schemas.microsoft.com/office/drawing/2016/5/14/chartex" xmlns:mc="http://schemas.openxmlformats.org/markup-compatibility/2006" xmlns:aink="http://schemas.microsoft.com/office/drawing/2016/ink" xmlns:am3d="http://schemas.microsoft.com/office/drawing/2017/model3d" xmlns:o="urn:schemas-microsoft-com:office:office" xmlns:oel="http://schemas.microsoft.com/office/2019/extlst" xmlns:r="http://schemas.openxmlformats.org/officeDocument/2006/relationships" xmlns:m="http://schemas.openxmlformats.org/officeDocument/2006/math" xmlns:v="urn:schemas-microsoft-com:vml" xmlns:wp14="http://schemas.microsoft.com/office/word/2010/wordprocessingDrawing" xmlns:wp="http://schemas.openxmlformats.org/drawingml/2006/wordprocessingDrawing" xmlns:w10="urn:schemas-microsoft-com:office:word" xmlns:w="http://schemas.openxmlformats.org/wordprocessingml/2006/main" xmlns:w14="http://schemas.microsoft.com/office/word/2010/wordml" xmlns:w15="http://schemas.microsoft.com/office/word/2012/wordml" xmlns:w16cex="http://schemas.microsoft.com/office/word/2018/wordml/cex" xmlns:w16cid="http://schemas.microsoft.com/office/word/2016/wordml/cid" xmlns:w16="http://schemas.microsoft.com/office/word/2018/wordml" xmlns:w16sdtdh="http://schemas.microsoft.com/office/word/2020/wordml/sdtdatahash" xmlns:w16se="http://schemas.microsoft.com/office/word/2015/wordml/symex" xmlns:wpg="http://schemas.microsoft.com/office/word/2010/wordprocessingGroup" xmlns:wpi="http://schemas.microsoft.com/office/word/2010/wordprocessingInk" xmlns:wne="http://schemas.microsoft.com/office/word/2006/wordml" xmlns:wps="http://schemas.microsoft.com/office/word/2010/wordprocessingShape" mc:Ignorable="w14 w15 w16se w16cid w16 w16cex w16sdtdh wp14">
+  <w:endnote w:type="separator" w:id="-1">
+    <w:p>
+      <w:pPr>
+        <w:spacing w:after="0"/>
+      </w:pPr>
+      <w:r>
+        <w:separator/>
+      </w:r>
+    </w:p>
+  </w:endnote>
+  <w:endnote w:type="continuationSeparator" w:id="0">
+    <w:p>
+      <w:pPr>
+        <w:spacing w:after="0"/>
+      </w:pPr>
+      <w:r>
+        <w:continuationSeparator/>
+      </w:r>
+    </w:p>
+  </w:endnote>
+</w:endnotes>
 </file>
 
 <file path=word/footnotes.xml><?xml version="1.0" encoding="utf-8"?>
-<w:footnotes xmlns:w="http://schemas.openxmlformats.org/wordprocessingml/2006/main" xmlns:m="http://schemas.openxmlformats.org/officeDocument/2006/math" xmlns:r="http://schemas.openxmlformats.org/officeDocument/2006/relationships" xmlns:o="urn:schemas-microsoft-com:office:office" xmlns:v="urn:schemas-microsoft-com:vml" xmlns:w10="urn:schemas-microsoft-com:office:word" xmlns:a="http://schemas.openxmlformats.org/drawingml/2006/main" xmlns:pic="http://schemas.openxmlformats.org/drawingml/2006/picture" xmlns:wp="http://schemas.openxmlformats.org/drawingml/2006/wordprocessingDrawing">
+<w:footnotes xmlns:wpc="http://schemas.microsoft.com/office/word/2010/wordprocessingCanvas" xmlns:cx="http://schemas.microsoft.com/office/drawing/2014/chartex" xmlns:cx1="http://schemas.microsoft.com/office/drawing/2015/9/8/chartex" xmlns:cx2="http://schemas.microsoft.com/office/drawing/2015/10/21/chartex" xmlns:cx3="http://schemas.microsoft.com/office/drawing/2016/5/9/chartex" xmlns:cx4="http://schemas.microsoft.com/office/drawing/2016/5/10/chartex" xmlns:cx5="http://schemas.microsoft.com/office/drawing/2016/5/11/chartex" xmlns:cx6="http://schemas.microsoft.com/office/drawing/2016/5/12/chartex" xmlns:cx7="http://schemas.microsoft.com/office/drawing/2016/5/13/chartex" xmlns:cx8="http://schemas.microsoft.com/office/drawing/2016/5/14/chartex" xmlns:mc="http://schemas.openxmlformats.org/markup-compatibility/2006" xmlns:aink="http://schemas.microsoft.com/office/drawing/2016/ink" xmlns:am3d="http://schemas.microsoft.com/office/drawing/2017/model3d" xmlns:o="urn:schemas-microsoft-com:office:office" xmlns:oel="http://schemas.microsoft.com/office/2019/extlst" xmlns:r="http://schemas.openxmlformats.org/officeDocument/2006/relationships" xmlns:m="http://schemas.openxmlformats.org/officeDocument/2006/math" xmlns:v="urn:schemas-microsoft-com:vml" xmlns:wp14="http://schemas.microsoft.com/office/word/2010/wordprocessingDrawing" xmlns:wp="http://schemas.openxmlformats.org/drawingml/2006/wordprocessingDrawing" xmlns:w10="urn:schemas-microsoft-com:office:word" xmlns:w="http://schemas.openxmlformats.org/wordprocessingml/2006/main" xmlns:w14="http://schemas.microsoft.com/office/word/2010/wordml" xmlns:w15="http://schemas.microsoft.com/office/word/2012/wordml" xmlns:w16cex="http://schemas.microsoft.com/office/word/2018/wordml/cex" xmlns:w16cid="http://schemas.microsoft.com/office/word/2016/wordml/cid" xmlns:w16="http://schemas.microsoft.com/office/word/2018/wordml" xmlns:w16sdtdh="http://schemas.microsoft.com/office/word/2020/wordml/sdtdatahash" xmlns:w16se="http://schemas.microsoft.com/office/word/2015/wordml/symex" xmlns:wpg="http://schemas.microsoft.com/office/word/2010/wordprocessingGroup" xmlns:wpi="http://schemas.microsoft.com/office/word/2010/wordprocessingInk" xmlns:wne="http://schemas.microsoft.com/office/word/2006/wordml" xmlns:wps="http://schemas.microsoft.com/office/word/2010/wordprocessingShape" mc:Ignorable="w14 w15 w16se w16cid w16 w16cex w16sdtdh wp14">
+  <w:footnote w:type="separator" w:id="-1">
+    <w:p>
+      <w:r>
+        <w:separator/>
+      </w:r>
+    </w:p>
+  </w:footnote>
   <w:footnote w:type="continuationSeparator" w:id="0">
     <w:p>
       <w:r>
         <w:continuationSeparator/>
-      </w:r>
-    </w:p>
-  </w:footnote>
-  <w:footnote w:type="separator" w:id="-1">
-    <w:p>
-      <w:r>
-        <w:separator/>
       </w:r>
     </w:p>
   </w:footnote>
@@ -1570,10 +1697,11 @@
 </file>
 
 <file path=word/numbering.xml><?xml version="1.0" encoding="utf-8"?>
-<w:numbering xmlns:w="http://schemas.openxmlformats.org/wordprocessingml/2006/main">
-  <w:abstractNum w:abstractNumId="990">
+<w:numbering xmlns:wpc="http://schemas.microsoft.com/office/word/2010/wordprocessingCanvas" xmlns:cx="http://schemas.microsoft.com/office/drawing/2014/chartex" xmlns:cx1="http://schemas.microsoft.com/office/drawing/2015/9/8/chartex" xmlns:cx2="http://schemas.microsoft.com/office/drawing/2015/10/21/chartex" xmlns:cx3="http://schemas.microsoft.com/office/drawing/2016/5/9/chartex" xmlns:cx4="http://schemas.microsoft.com/office/drawing/2016/5/10/chartex" xmlns:cx5="http://schemas.microsoft.com/office/drawing/2016/5/11/chartex" xmlns:cx6="http://schemas.microsoft.com/office/drawing/2016/5/12/chartex" xmlns:cx7="http://schemas.microsoft.com/office/drawing/2016/5/13/chartex" xmlns:cx8="http://schemas.microsoft.com/office/drawing/2016/5/14/chartex" xmlns:mc="http://schemas.openxmlformats.org/markup-compatibility/2006" xmlns:aink="http://schemas.microsoft.com/office/drawing/2016/ink" xmlns:am3d="http://schemas.microsoft.com/office/drawing/2017/model3d" xmlns:o="urn:schemas-microsoft-com:office:office" xmlns:oel="http://schemas.microsoft.com/office/2019/extlst" xmlns:r="http://schemas.openxmlformats.org/officeDocument/2006/relationships" xmlns:m="http://schemas.openxmlformats.org/officeDocument/2006/math" xmlns:v="urn:schemas-microsoft-com:vml" xmlns:wp14="http://schemas.microsoft.com/office/word/2010/wordprocessingDrawing" xmlns:wp="http://schemas.openxmlformats.org/drawingml/2006/wordprocessingDrawing" xmlns:w10="urn:schemas-microsoft-com:office:word" xmlns:w="http://schemas.openxmlformats.org/wordprocessingml/2006/main" xmlns:w14="http://schemas.microsoft.com/office/word/2010/wordml" xmlns:w15="http://schemas.microsoft.com/office/word/2012/wordml" xmlns:w16cex="http://schemas.microsoft.com/office/word/2018/wordml/cex" xmlns:w16cid="http://schemas.microsoft.com/office/word/2016/wordml/cid" xmlns:w16="http://schemas.microsoft.com/office/word/2018/wordml" xmlns:w16sdtdh="http://schemas.microsoft.com/office/word/2020/wordml/sdtdatahash" xmlns:w16se="http://schemas.microsoft.com/office/word/2015/wordml/symex" xmlns:wpg="http://schemas.microsoft.com/office/word/2010/wordprocessingGroup" xmlns:wpi="http://schemas.microsoft.com/office/word/2010/wordprocessingInk" xmlns:wne="http://schemas.microsoft.com/office/word/2006/wordml" xmlns:wps="http://schemas.microsoft.com/office/word/2010/wordprocessingShape" mc:Ignorable="w14 w15 w16se w16cid w16 w16cex w16sdtdh wp14">
+  <w:abstractNum w:abstractNumId="0" w15:restartNumberingAfterBreak="0">
     <w:nsid w:val="0000A990"/>
     <w:multiLevelType w:val="multilevel"/>
+    <w:tmpl w:val="C5A4C306"/>
     <w:lvl w:ilvl="0">
       <w:numFmt w:val="bullet"/>
       <w:lvlText w:val=" "/>
@@ -1647,9 +1775,10 @@
       </w:pPr>
     </w:lvl>
   </w:abstractNum>
-  <w:abstractNum w:abstractNumId="991">
+  <w:abstractNum w:abstractNumId="1" w15:restartNumberingAfterBreak="0">
     <w:nsid w:val="0000A991"/>
     <w:multiLevelType w:val="multilevel"/>
+    <w:tmpl w:val="6E0404EE"/>
     <w:lvl w:ilvl="0">
       <w:numFmt w:val="bullet"/>
       <w:lvlText w:val="•"/>
@@ -1723,24 +1852,24 @@
       </w:pPr>
     </w:lvl>
   </w:abstractNum>
-  <w:num w:numId="1000">
-    <w:abstractNumId w:val="990"/>
+  <w:num w:numId="1" w16cid:durableId="1298534429">
+    <w:abstractNumId w:val="0"/>
   </w:num>
-  <w:num w:numId="1001">
-    <w:abstractNumId w:val="991"/>
+  <w:num w:numId="2" w16cid:durableId="1012683201">
+    <w:abstractNumId w:val="1"/>
   </w:num>
 </w:numbering>
 </file>
 
 <file path=word/styles.xml><?xml version="1.0" encoding="utf-8"?>
-<w:styles xmlns:r="http://schemas.openxmlformats.org/officeDocument/2006/relationships" xmlns:w="http://schemas.openxmlformats.org/wordprocessingml/2006/main">
+<w:styles xmlns:mc="http://schemas.openxmlformats.org/markup-compatibility/2006" xmlns:r="http://schemas.openxmlformats.org/officeDocument/2006/relationships" xmlns:w="http://schemas.openxmlformats.org/wordprocessingml/2006/main" xmlns:w14="http://schemas.microsoft.com/office/word/2010/wordml" xmlns:w15="http://schemas.microsoft.com/office/word/2012/wordml" xmlns:w16cex="http://schemas.microsoft.com/office/word/2018/wordml/cex" xmlns:w16cid="http://schemas.microsoft.com/office/word/2016/wordml/cid" xmlns:w16="http://schemas.microsoft.com/office/word/2018/wordml" xmlns:w16sdtdh="http://schemas.microsoft.com/office/word/2020/wordml/sdtdatahash" xmlns:w16se="http://schemas.microsoft.com/office/word/2015/wordml/symex" mc:Ignorable="w14 w15 w16se w16cid w16 w16cex w16sdtdh">
   <w:docDefaults>
     <w:rPrDefault>
       <w:rPr>
-        <w:rFonts w:asciiTheme="minorHAnsi" w:cstheme="minorBidi" w:eastAsiaTheme="minorHAnsi" w:hAnsiTheme="minorHAnsi"/>
+        <w:rFonts w:asciiTheme="minorHAnsi" w:eastAsiaTheme="minorHAnsi" w:hAnsiTheme="minorHAnsi" w:cstheme="minorBidi"/>
         <w:sz w:val="24"/>
         <w:szCs w:val="24"/>
-        <w:lang w:bidi="ar-SA" w:eastAsia="en-US" w:val="en-US"/>
+        <w:lang w:val="en-US" w:eastAsia="en-US" w:bidi="ar-SA"/>
       </w:rPr>
     </w:rPrDefault>
     <w:pPrDefault>
@@ -1749,35 +1878,478 @@
       </w:pPr>
     </w:pPrDefault>
   </w:docDefaults>
-  <w:latentStyles w:count="276" w:defLockedState="0" w:defQFormat="0" w:defSemiHidden="0" w:defUIPriority="0" w:defUnhideWhenUsed="0"/>
-  <w:style w:default="1" w:styleId="Normal" w:type="paragraph">
+  <w:latentStyles w:defLockedState="0" w:defUIPriority="0" w:defSemiHidden="0" w:defUnhideWhenUsed="0" w:defQFormat="0" w:count="376">
+    <w:lsdException w:name="Normal Table" w:semiHidden="1" w:unhideWhenUsed="1"/>
+    <w:lsdException w:name="Table Simple 1" w:semiHidden="1" w:unhideWhenUsed="1"/>
+    <w:lsdException w:name="Table Simple 2" w:semiHidden="1" w:unhideWhenUsed="1"/>
+    <w:lsdException w:name="Table Simple 3" w:semiHidden="1" w:unhideWhenUsed="1"/>
+    <w:lsdException w:name="Table Classic 1" w:semiHidden="1" w:unhideWhenUsed="1"/>
+    <w:lsdException w:name="Table Classic 2" w:semiHidden="1" w:unhideWhenUsed="1"/>
+    <w:lsdException w:name="Table Classic 3" w:semiHidden="1" w:unhideWhenUsed="1"/>
+    <w:lsdException w:name="Table Classic 4" w:semiHidden="1" w:unhideWhenUsed="1"/>
+    <w:lsdException w:name="Table Colorful 1" w:semiHidden="1" w:unhideWhenUsed="1"/>
+    <w:lsdException w:name="Table Colorful 2" w:semiHidden="1" w:unhideWhenUsed="1"/>
+    <w:lsdException w:name="Table Colorful 3" w:semiHidden="1" w:unhideWhenUsed="1"/>
+    <w:lsdException w:name="Table Columns 1" w:semiHidden="1" w:unhideWhenUsed="1"/>
+    <w:lsdException w:name="Table Columns 2" w:semiHidden="1" w:unhideWhenUsed="1"/>
+    <w:lsdException w:name="Table Columns 3" w:semiHidden="1" w:unhideWhenUsed="1"/>
+    <w:lsdException w:name="Table Columns 4" w:semiHidden="1" w:unhideWhenUsed="1"/>
+    <w:lsdException w:name="Table Columns 5" w:semiHidden="1" w:unhideWhenUsed="1"/>
+    <w:lsdException w:name="Table Grid 1" w:semiHidden="1" w:unhideWhenUsed="1"/>
+    <w:lsdException w:name="Table Grid 2" w:semiHidden="1" w:unhideWhenUsed="1"/>
+    <w:lsdException w:name="Table Grid 3" w:semiHidden="1" w:unhideWhenUsed="1"/>
+    <w:lsdException w:name="Table Grid 4" w:semiHidden="1" w:unhideWhenUsed="1"/>
+    <w:lsdException w:name="Table Grid 5" w:semiHidden="1" w:unhideWhenUsed="1"/>
+    <w:lsdException w:name="Table Grid 6" w:semiHidden="1" w:unhideWhenUsed="1"/>
+    <w:lsdException w:name="Table Grid 7" w:semiHidden="1" w:unhideWhenUsed="1"/>
+    <w:lsdException w:name="Table Grid 8" w:semiHidden="1" w:unhideWhenUsed="1"/>
+    <w:lsdException w:name="Table List 1" w:semiHidden="1" w:unhideWhenUsed="1"/>
+    <w:lsdException w:name="Table List 2" w:semiHidden="1" w:unhideWhenUsed="1"/>
+    <w:lsdException w:name="Table List 3" w:semiHidden="1" w:unhideWhenUsed="1"/>
+    <w:lsdException w:name="Table List 4" w:semiHidden="1" w:unhideWhenUsed="1"/>
+    <w:lsdException w:name="Table List 5" w:semiHidden="1" w:unhideWhenUsed="1"/>
+    <w:lsdException w:name="Table List 6" w:semiHidden="1" w:unhideWhenUsed="1"/>
+    <w:lsdException w:name="Table List 7" w:semiHidden="1" w:unhideWhenUsed="1"/>
+    <w:lsdException w:name="Table List 8" w:semiHidden="1" w:unhideWhenUsed="1"/>
+    <w:lsdException w:name="Table 3D effects 1" w:semiHidden="1" w:unhideWhenUsed="1"/>
+    <w:lsdException w:name="Table 3D effects 2" w:semiHidden="1" w:unhideWhenUsed="1"/>
+    <w:lsdException w:name="Table 3D effects 3" w:semiHidden="1" w:unhideWhenUsed="1"/>
+    <w:lsdException w:name="Table Contemporary" w:semiHidden="1" w:unhideWhenUsed="1"/>
+    <w:lsdException w:name="Table Elegant" w:semiHidden="1" w:unhideWhenUsed="1"/>
+    <w:lsdException w:name="Table Professional" w:semiHidden="1" w:unhideWhenUsed="1"/>
+    <w:lsdException w:name="Table Subtle 1" w:semiHidden="1" w:unhideWhenUsed="1"/>
+    <w:lsdException w:name="Table Subtle 2" w:semiHidden="1" w:unhideWhenUsed="1"/>
+    <w:lsdException w:name="Table Web 1" w:semiHidden="1" w:unhideWhenUsed="1"/>
+    <w:lsdException w:name="Table Web 2" w:semiHidden="1" w:unhideWhenUsed="1"/>
+    <w:lsdException w:name="Table Web 3" w:semiHidden="1" w:unhideWhenUsed="1"/>
+    <w:lsdException w:name="Table Theme" w:semiHidden="1" w:unhideWhenUsed="1"/>
+    <w:lsdException w:name="Light Shading"/>
+    <w:lsdException w:name="Light List"/>
+    <w:lsdException w:name="Light Grid"/>
+    <w:lsdException w:name="Medium Shading 1"/>
+    <w:lsdException w:name="Medium Shading 2"/>
+    <w:lsdException w:name="Medium List 1"/>
+    <w:lsdException w:name="Medium List 2"/>
+    <w:lsdException w:name="Medium Grid 1"/>
+    <w:lsdException w:name="Medium Grid 2"/>
+    <w:lsdException w:name="Medium Grid 3"/>
+    <w:lsdException w:name="Dark List"/>
+    <w:lsdException w:name="Colorful Shading"/>
+    <w:lsdException w:name="Colorful List"/>
+    <w:lsdException w:name="Colorful Grid"/>
+    <w:lsdException w:name="Light Shading Accent 1"/>
+    <w:lsdException w:name="Light List Accent 1"/>
+    <w:lsdException w:name="Light Grid Accent 1"/>
+    <w:lsdException w:name="Medium Shading 1 Accent 1"/>
+    <w:lsdException w:name="Medium Shading 2 Accent 1"/>
+    <w:lsdException w:name="Medium List 1 Accent 1"/>
+    <w:lsdException w:name="Medium List 2 Accent 1"/>
+    <w:lsdException w:name="Medium Grid 1 Accent 1"/>
+    <w:lsdException w:name="Medium Grid 2 Accent 1"/>
+    <w:lsdException w:name="Medium Grid 3 Accent 1"/>
+    <w:lsdException w:name="Dark List Accent 1"/>
+    <w:lsdException w:name="Colorful Shading Accent 1"/>
+    <w:lsdException w:name="Colorful List Accent 1"/>
+    <w:lsdException w:name="Colorful Grid Accent 1"/>
+    <w:lsdException w:name="Light Shading Accent 2"/>
+    <w:lsdException w:name="Light List Accent 2"/>
+    <w:lsdException w:name="Light Grid Accent 2"/>
+    <w:lsdException w:name="Medium Shading 1 Accent 2"/>
+    <w:lsdException w:name="Medium Shading 2 Accent 2"/>
+    <w:lsdException w:name="Medium List 1 Accent 2"/>
+    <w:lsdException w:name="Medium List 2 Accent 2"/>
+    <w:lsdException w:name="Medium Grid 1 Accent 2"/>
+    <w:lsdException w:name="Medium Grid 2 Accent 2"/>
+    <w:lsdException w:name="Medium Grid 3 Accent 2"/>
+    <w:lsdException w:name="Dark List Accent 2"/>
+    <w:lsdException w:name="Colorful Shading Accent 2"/>
+    <w:lsdException w:name="Colorful List Accent 2"/>
+    <w:lsdException w:name="Colorful Grid Accent 2"/>
+    <w:lsdException w:name="Light Shading Accent 3"/>
+    <w:lsdException w:name="Light List Accent 3"/>
+    <w:lsdException w:name="Light Grid Accent 3"/>
+    <w:lsdException w:name="Medium Shading 1 Accent 3"/>
+    <w:lsdException w:name="Medium Shading 2 Accent 3"/>
+    <w:lsdException w:name="Medium List 1 Accent 3"/>
+    <w:lsdException w:name="Medium List 2 Accent 3"/>
+    <w:lsdException w:name="Medium Grid 1 Accent 3"/>
+    <w:lsdException w:name="Medium Grid 2 Accent 3"/>
+    <w:lsdException w:name="Medium Grid 3 Accent 3"/>
+    <w:lsdException w:name="Dark List Accent 3"/>
+    <w:lsdException w:name="Colorful Shading Accent 3"/>
+    <w:lsdException w:name="Colorful List Accent 3"/>
+    <w:lsdException w:name="Colorful Grid Accent 3"/>
+    <w:lsdException w:name="Light Shading Accent 4"/>
+    <w:lsdException w:name="Light List Accent 4"/>
+    <w:lsdException w:name="Light Grid Accent 4"/>
+    <w:lsdException w:name="Medium Shading 1 Accent 4"/>
+    <w:lsdException w:name="Medium Shading 2 Accent 4"/>
+    <w:lsdException w:name="Medium List 1 Accent 4"/>
+    <w:lsdException w:name="Medium List 2 Accent 4"/>
+    <w:lsdException w:name="Medium Grid 1 Accent 4"/>
+    <w:lsdException w:name="Medium Grid 2 Accent 4"/>
+    <w:lsdException w:name="Medium Grid 3 Accent 4"/>
+    <w:lsdException w:name="Dark List Accent 4"/>
+    <w:lsdException w:name="Colorful Shading Accent 4"/>
+    <w:lsdException w:name="Colorful List Accent 4"/>
+    <w:lsdException w:name="Colorful Grid Accent 4"/>
+    <w:lsdException w:name="Light Shading Accent 5"/>
+    <w:lsdException w:name="Light List Accent 5"/>
+    <w:lsdException w:name="Light Grid Accent 5"/>
+    <w:lsdException w:name="Medium Shading 1 Accent 5"/>
+    <w:lsdException w:name="Medium Shading 2 Accent 5"/>
+    <w:lsdException w:name="Medium List 1 Accent 5"/>
+    <w:lsdException w:name="Medium List 2 Accent 5"/>
+    <w:lsdException w:name="Medium Grid 1 Accent 5"/>
+    <w:lsdException w:name="Medium Grid 2 Accent 5"/>
+    <w:lsdException w:name="Medium Grid 3 Accent 5"/>
+    <w:lsdException w:name="Dark List Accent 5"/>
+    <w:lsdException w:name="Colorful Shading Accent 5"/>
+    <w:lsdException w:name="Colorful List Accent 5"/>
+    <w:lsdException w:name="Colorful Grid Accent 5"/>
+    <w:lsdException w:name="Light Shading Accent 6"/>
+    <w:lsdException w:name="Light List Accent 6"/>
+    <w:lsdException w:name="Light Grid Accent 6"/>
+    <w:lsdException w:name="Medium Shading 1 Accent 6"/>
+    <w:lsdException w:name="Medium Shading 2 Accent 6"/>
+    <w:lsdException w:name="Medium List 1 Accent 6"/>
+    <w:lsdException w:name="Medium List 2 Accent 6"/>
+    <w:lsdException w:name="Medium Grid 1 Accent 6"/>
+    <w:lsdException w:name="Medium Grid 2 Accent 6"/>
+    <w:lsdException w:name="Medium Grid 3 Accent 6"/>
+    <w:lsdException w:name="Dark List Accent 6"/>
+    <w:lsdException w:name="Colorful Shading Accent 6"/>
+    <w:lsdException w:name="Colorful List Accent 6"/>
+    <w:lsdException w:name="Colorful Grid Accent 6"/>
+    <w:lsdException w:name="Grid Table 4" w:uiPriority="49"/>
+    <w:lsdException w:name="Grid Table 5 Dark" w:uiPriority="50"/>
+    <w:lsdException w:name="Grid Table 6 Colorful" w:uiPriority="51"/>
+    <w:lsdException w:name="Grid Table 7 Colorful" w:uiPriority="52"/>
+    <w:lsdException w:name="Grid Table 1 Light Accent 1" w:uiPriority="46"/>
+    <w:lsdException w:name="Grid Table 2 Accent 1" w:uiPriority="47"/>
+    <w:lsdException w:name="Grid Table 3 Accent 1" w:uiPriority="48"/>
+    <w:lsdException w:name="Grid Table 4 Accent 1" w:uiPriority="49"/>
+    <w:lsdException w:name="Grid Table 5 Dark Accent 1" w:uiPriority="50"/>
+    <w:lsdException w:name="Grid Table 6 Colorful Accent 1" w:uiPriority="51"/>
+    <w:lsdException w:name="Grid Table 7 Colorful Accent 1" w:uiPriority="52"/>
+    <w:lsdException w:name="Grid Table 1 Light Accent 2" w:uiPriority="46"/>
+    <w:lsdException w:name="Grid Table 2 Accent 2" w:uiPriority="47"/>
+    <w:lsdException w:name="Grid Table 3 Accent 2" w:uiPriority="48"/>
+    <w:lsdException w:name="Grid Table 4 Accent 2" w:uiPriority="49"/>
+    <w:lsdException w:name="Grid Table 5 Dark Accent 2" w:uiPriority="50"/>
+    <w:lsdException w:name="Grid Table 6 Colorful Accent 2" w:uiPriority="51"/>
+    <w:lsdException w:name="Grid Table 7 Colorful Accent 2" w:uiPriority="52"/>
+    <w:lsdException w:name="Grid Table 1 Light Accent 3" w:uiPriority="46"/>
+    <w:lsdException w:name="Grid Table 2 Accent 3" w:uiPriority="47"/>
+    <w:lsdException w:name="Grid Table 3 Accent 3" w:uiPriority="48"/>
+    <w:lsdException w:name="Grid Table 4 Accent 3" w:uiPriority="49"/>
+    <w:lsdException w:name="Grid Table 5 Dark Accent 3" w:uiPriority="50"/>
+    <w:lsdException w:name="Grid Table 6 Colorful Accent 3" w:uiPriority="51"/>
+    <w:lsdException w:name="Grid Table 7 Colorful Accent 3" w:uiPriority="52"/>
+    <w:lsdException w:name="Grid Table 1 Light Accent 4" w:uiPriority="46"/>
+    <w:lsdException w:name="Grid Table 2 Accent 4" w:uiPriority="47"/>
+    <w:lsdException w:name="Grid Table 3 Accent 4" w:uiPriority="48"/>
+    <w:lsdException w:name="Grid Table 4 Accent 4" w:uiPriority="49"/>
+    <w:lsdException w:name="Grid Table 5 Dark Accent 4" w:uiPriority="50"/>
+    <w:lsdException w:name="Grid Table 6 Colorful Accent 4" w:uiPriority="51"/>
+    <w:lsdException w:name="Grid Table 7 Colorful Accent 4" w:uiPriority="52"/>
+    <w:lsdException w:name="Grid Table 1 Light Accent 5" w:uiPriority="46"/>
+    <w:lsdException w:name="Grid Table 2 Accent 5" w:uiPriority="47"/>
+    <w:lsdException w:name="Grid Table 3 Accent 5" w:uiPriority="48"/>
+    <w:lsdException w:name="Grid Table 4 Accent 5" w:uiPriority="49"/>
+    <w:lsdException w:name="Grid Table 5 Dark Accent 5" w:uiPriority="50"/>
+    <w:lsdException w:name="Grid Table 6 Colorful Accent 5" w:uiPriority="51"/>
+    <w:lsdException w:name="Grid Table 7 Colorful Accent 5" w:uiPriority="52"/>
+    <w:lsdException w:name="Grid Table 1 Light Accent 6" w:uiPriority="46"/>
+    <w:lsdException w:name="Grid Table 2 Accent 6" w:uiPriority="47"/>
+    <w:lsdException w:name="Grid Table 3 Accent 6" w:uiPriority="48"/>
+    <w:lsdException w:name="Grid Table 4 Accent 6" w:uiPriority="49"/>
+    <w:lsdException w:name="Grid Table 5 Dark Accent 6" w:uiPriority="50"/>
+    <w:lsdException w:name="Grid Table 6 Colorful Accent 6" w:uiPriority="51"/>
+    <w:lsdException w:name="Grid Table 7 Colorful Accent 6" w:uiPriority="52"/>
+    <w:lsdException w:name="List Table 1 Light" w:uiPriority="46"/>
+    <w:lsdException w:name="List Table 2" w:uiPriority="47"/>
+    <w:lsdException w:name="List Table 3" w:uiPriority="48"/>
+    <w:lsdException w:name="List Table 4" w:uiPriority="49"/>
+    <w:lsdException w:name="List Table 5 Dark" w:uiPriority="50"/>
+    <w:lsdException w:name="List Table 6 Colorful" w:uiPriority="51"/>
+    <w:lsdException w:name="List Table 7 Colorful" w:uiPriority="52"/>
+    <w:lsdException w:name="List Table 1 Light Accent 1" w:uiPriority="46"/>
+    <w:lsdException w:name="List Table 2 Accent 1" w:uiPriority="47"/>
+    <w:lsdException w:name="List Table 3 Accent 1" w:uiPriority="48"/>
+    <w:lsdException w:name="List Table 4 Accent 1" w:uiPriority="49"/>
+    <w:lsdException w:name="List Table 5 Dark Accent 1" w:uiPriority="50"/>
+    <w:lsdException w:name="List Table 6 Colorful Accent 1" w:uiPriority="51"/>
+    <w:lsdException w:name="List Table 7 Colorful Accent 1" w:uiPriority="52"/>
+    <w:lsdException w:name="List Table 1 Light Accent 2" w:uiPriority="46"/>
+    <w:lsdException w:name="List Table 2 Accent 2" w:uiPriority="47"/>
+    <w:lsdException w:name="List Table 3 Accent 2" w:uiPriority="48"/>
+    <w:lsdException w:name="List Table 4 Accent 2" w:uiPriority="49"/>
+    <w:lsdException w:name="List Table 5 Dark Accent 2" w:uiPriority="50"/>
+    <w:lsdException w:name="List Table 6 Colorful Accent 2" w:uiPriority="51"/>
+    <w:lsdException w:name="List Table 7 Colorful Accent 2" w:uiPriority="52"/>
+    <w:lsdException w:name="List Table 1 Light Accent 3" w:uiPriority="46"/>
+    <w:lsdException w:name="List Table 2 Accent 3" w:uiPriority="47"/>
+    <w:lsdException w:name="List Table 3 Accent 3" w:uiPriority="48"/>
+    <w:lsdException w:name="List Table 4 Accent 3" w:uiPriority="49"/>
+    <w:lsdException w:name="List Table 5 Dark Accent 3" w:uiPriority="50"/>
+    <w:lsdException w:name="List Table 6 Colorful Accent 3" w:uiPriority="51"/>
+    <w:lsdException w:name="List Table 7 Colorful Accent 3" w:uiPriority="52"/>
+    <w:lsdException w:name="List Table 1 Light Accent 4" w:uiPriority="46"/>
+    <w:lsdException w:name="List Table 2 Accent 4" w:uiPriority="47"/>
+    <w:lsdException w:name="List Table 3 Accent 4" w:uiPriority="48"/>
+    <w:lsdException w:name="List Table 4 Accent 4" w:uiPriority="49"/>
+    <w:lsdException w:name="List Table 5 Dark Accent 4" w:uiPriority="50"/>
+    <w:lsdException w:name="List Table 6 Colorful Accent 4" w:uiPriority="51"/>
+    <w:lsdException w:name="List Table 7 Colorful Accent 4" w:uiPriority="52"/>
+    <w:lsdException w:name="List Table 1 Light Accent 5" w:uiPriority="46"/>
+    <w:lsdException w:name="List Table 2 Accent 5" w:uiPriority="47"/>
+    <w:lsdException w:name="List Table 3 Accent 5" w:uiPriority="48"/>
+    <w:lsdException w:name="List Table 4 Accent 5" w:uiPriority="49"/>
+    <w:lsdException w:name="List Table 5 Dark Accent 5" w:uiPriority="50"/>
+    <w:lsdException w:name="List Table 6 Colorful Accent 5" w:uiPriority="51"/>
+    <w:lsdException w:name="List Table 7 Colorful Accent 5" w:uiPriority="52"/>
+    <w:lsdException w:name="List Table 1 Light Accent 6" w:uiPriority="46"/>
+    <w:lsdException w:name="List Table 2 Accent 6" w:uiPriority="47"/>
+    <w:lsdException w:name="List Table 3 Accent 6" w:uiPriority="48"/>
+    <w:lsdException w:name="List Table 4 Accent 6" w:uiPriority="49"/>
+    <w:lsdException w:name="List Table 5 Dark Accent 6" w:uiPriority="50"/>
+    <w:lsdException w:name="List Table 6 Colorful Accent 6" w:uiPriority="51"/>
+    <w:lsdException w:name="List Table 7 Colorful Accent 6" w:uiPriority="52"/>
+    <w:lsdException w:name="Mention" w:semiHidden="1" w:uiPriority="99" w:unhideWhenUsed="1"/>
+    <w:lsdException w:name="Smart Hyperlink" w:semiHidden="1" w:uiPriority="99" w:unhideWhenUsed="1"/>
+    <w:lsdException w:name="Hashtag" w:semiHidden="1" w:uiPriority="99" w:unhideWhenUsed="1"/>
+    <w:lsdException w:name="Unresolved Mention" w:semiHidden="1" w:uiPriority="99" w:unhideWhenUsed="1"/>
+    <w:lsdException w:name="Smart Link" w:semiHidden="1" w:uiPriority="99" w:unhideWhenUsed="1"/>
+  </w:latentStyles>
+  <w:style w:type="paragraph" w:default="1" w:styleId="Normal">
     <w:name w:val="Normal"/>
     <w:qFormat/>
   </w:style>
-  <w:style w:styleId="BodyText" w:type="paragraph">
+  <w:style w:type="paragraph" w:styleId="Heading1">
+    <w:name w:val="heading 1"/>
+    <w:basedOn w:val="Normal"/>
+    <w:next w:val="BodyText"/>
+    <w:uiPriority w:val="9"/>
+    <w:qFormat/>
+    <w:pPr>
+      <w:keepNext/>
+      <w:keepLines/>
+      <w:spacing w:before="480" w:after="0"/>
+      <w:outlineLvl w:val="0"/>
+    </w:pPr>
+    <w:rPr>
+      <w:rFonts w:asciiTheme="majorHAnsi" w:eastAsiaTheme="majorEastAsia" w:hAnsiTheme="majorHAnsi" w:cstheme="majorBidi"/>
+      <w:b/>
+      <w:bCs/>
+      <w:color w:val="4F81BD" w:themeColor="accent1"/>
+      <w:sz w:val="32"/>
+      <w:szCs w:val="32"/>
+    </w:rPr>
+  </w:style>
+  <w:style w:type="paragraph" w:styleId="Heading2">
+    <w:name w:val="heading 2"/>
+    <w:basedOn w:val="Normal"/>
+    <w:next w:val="BodyText"/>
+    <w:uiPriority w:val="9"/>
+    <w:unhideWhenUsed/>
+    <w:qFormat/>
+    <w:pPr>
+      <w:keepNext/>
+      <w:keepLines/>
+      <w:spacing w:before="200" w:after="0"/>
+      <w:outlineLvl w:val="1"/>
+    </w:pPr>
+    <w:rPr>
+      <w:rFonts w:asciiTheme="majorHAnsi" w:eastAsiaTheme="majorEastAsia" w:hAnsiTheme="majorHAnsi" w:cstheme="majorBidi"/>
+      <w:b/>
+      <w:bCs/>
+      <w:color w:val="4F81BD" w:themeColor="accent1"/>
+      <w:sz w:val="28"/>
+      <w:szCs w:val="28"/>
+    </w:rPr>
+  </w:style>
+  <w:style w:type="paragraph" w:styleId="Heading3">
+    <w:name w:val="heading 3"/>
+    <w:basedOn w:val="Normal"/>
+    <w:next w:val="BodyText"/>
+    <w:uiPriority w:val="9"/>
+    <w:unhideWhenUsed/>
+    <w:qFormat/>
+    <w:pPr>
+      <w:keepNext/>
+      <w:keepLines/>
+      <w:spacing w:before="200" w:after="0"/>
+      <w:outlineLvl w:val="2"/>
+    </w:pPr>
+    <w:rPr>
+      <w:rFonts w:asciiTheme="majorHAnsi" w:eastAsiaTheme="majorEastAsia" w:hAnsiTheme="majorHAnsi" w:cstheme="majorBidi"/>
+      <w:b/>
+      <w:bCs/>
+      <w:color w:val="4F81BD" w:themeColor="accent1"/>
+    </w:rPr>
+  </w:style>
+  <w:style w:type="paragraph" w:styleId="Heading4">
+    <w:name w:val="heading 4"/>
+    <w:basedOn w:val="Normal"/>
+    <w:next w:val="BodyText"/>
+    <w:uiPriority w:val="9"/>
+    <w:unhideWhenUsed/>
+    <w:qFormat/>
+    <w:pPr>
+      <w:keepNext/>
+      <w:keepLines/>
+      <w:spacing w:before="200" w:after="0"/>
+      <w:outlineLvl w:val="3"/>
+    </w:pPr>
+    <w:rPr>
+      <w:rFonts w:asciiTheme="majorHAnsi" w:eastAsiaTheme="majorEastAsia" w:hAnsiTheme="majorHAnsi" w:cstheme="majorBidi"/>
+      <w:bCs/>
+      <w:i/>
+      <w:color w:val="4F81BD" w:themeColor="accent1"/>
+    </w:rPr>
+  </w:style>
+  <w:style w:type="paragraph" w:styleId="Heading5">
+    <w:name w:val="heading 5"/>
+    <w:basedOn w:val="Normal"/>
+    <w:next w:val="BodyText"/>
+    <w:uiPriority w:val="9"/>
+    <w:unhideWhenUsed/>
+    <w:qFormat/>
+    <w:pPr>
+      <w:keepNext/>
+      <w:keepLines/>
+      <w:spacing w:before="200" w:after="0"/>
+      <w:outlineLvl w:val="4"/>
+    </w:pPr>
+    <w:rPr>
+      <w:rFonts w:asciiTheme="majorHAnsi" w:eastAsiaTheme="majorEastAsia" w:hAnsiTheme="majorHAnsi" w:cstheme="majorBidi"/>
+      <w:iCs/>
+      <w:color w:val="4F81BD" w:themeColor="accent1"/>
+    </w:rPr>
+  </w:style>
+  <w:style w:type="paragraph" w:styleId="Heading6">
+    <w:name w:val="heading 6"/>
+    <w:basedOn w:val="Normal"/>
+    <w:next w:val="BodyText"/>
+    <w:uiPriority w:val="9"/>
+    <w:unhideWhenUsed/>
+    <w:qFormat/>
+    <w:pPr>
+      <w:keepNext/>
+      <w:keepLines/>
+      <w:spacing w:before="200" w:after="0"/>
+      <w:outlineLvl w:val="5"/>
+    </w:pPr>
+    <w:rPr>
+      <w:rFonts w:asciiTheme="majorHAnsi" w:eastAsiaTheme="majorEastAsia" w:hAnsiTheme="majorHAnsi" w:cstheme="majorBidi"/>
+      <w:color w:val="4F81BD" w:themeColor="accent1"/>
+    </w:rPr>
+  </w:style>
+  <w:style w:type="paragraph" w:styleId="Heading7">
+    <w:name w:val="heading 7"/>
+    <w:basedOn w:val="Normal"/>
+    <w:next w:val="BodyText"/>
+    <w:uiPriority w:val="9"/>
+    <w:unhideWhenUsed/>
+    <w:qFormat/>
+    <w:pPr>
+      <w:keepNext/>
+      <w:keepLines/>
+      <w:spacing w:before="200" w:after="0"/>
+      <w:outlineLvl w:val="6"/>
+    </w:pPr>
+    <w:rPr>
+      <w:rFonts w:asciiTheme="majorHAnsi" w:eastAsiaTheme="majorEastAsia" w:hAnsiTheme="majorHAnsi" w:cstheme="majorBidi"/>
+      <w:color w:val="4F81BD" w:themeColor="accent1"/>
+    </w:rPr>
+  </w:style>
+  <w:style w:type="paragraph" w:styleId="Heading8">
+    <w:name w:val="heading 8"/>
+    <w:basedOn w:val="Normal"/>
+    <w:next w:val="BodyText"/>
+    <w:uiPriority w:val="9"/>
+    <w:unhideWhenUsed/>
+    <w:qFormat/>
+    <w:pPr>
+      <w:keepNext/>
+      <w:keepLines/>
+      <w:spacing w:before="200" w:after="0"/>
+      <w:outlineLvl w:val="7"/>
+    </w:pPr>
+    <w:rPr>
+      <w:rFonts w:asciiTheme="majorHAnsi" w:eastAsiaTheme="majorEastAsia" w:hAnsiTheme="majorHAnsi" w:cstheme="majorBidi"/>
+      <w:color w:val="4F81BD" w:themeColor="accent1"/>
+    </w:rPr>
+  </w:style>
+  <w:style w:type="paragraph" w:styleId="Heading9">
+    <w:name w:val="heading 9"/>
+    <w:basedOn w:val="Normal"/>
+    <w:next w:val="BodyText"/>
+    <w:uiPriority w:val="9"/>
+    <w:unhideWhenUsed/>
+    <w:qFormat/>
+    <w:pPr>
+      <w:keepNext/>
+      <w:keepLines/>
+      <w:spacing w:before="200" w:after="0"/>
+      <w:outlineLvl w:val="8"/>
+    </w:pPr>
+    <w:rPr>
+      <w:rFonts w:asciiTheme="majorHAnsi" w:eastAsiaTheme="majorEastAsia" w:hAnsiTheme="majorHAnsi" w:cstheme="majorBidi"/>
+      <w:color w:val="4F81BD" w:themeColor="accent1"/>
+    </w:rPr>
+  </w:style>
+  <w:style w:type="character" w:default="1" w:styleId="DefaultParagraphFont">
+    <w:name w:val="Default Paragraph Font"/>
+    <w:uiPriority w:val="1"/>
+    <w:semiHidden/>
+    <w:unhideWhenUsed/>
+  </w:style>
+  <w:style w:type="table" w:default="1" w:styleId="TableNormal">
+    <w:name w:val="Normal Table"/>
+    <w:uiPriority w:val="99"/>
+    <w:semiHidden/>
+    <w:unhideWhenUsed/>
+    <w:tblPr>
+      <w:tblInd w:w="0" w:type="dxa"/>
+      <w:tblCellMar>
+        <w:top w:w="0" w:type="dxa"/>
+        <w:left w:w="108" w:type="dxa"/>
+        <w:bottom w:w="0" w:type="dxa"/>
+        <w:right w:w="108" w:type="dxa"/>
+      </w:tblCellMar>
+    </w:tblPr>
+  </w:style>
+  <w:style w:type="numbering" w:default="1" w:styleId="NoList">
+    <w:name w:val="No List"/>
+    <w:uiPriority w:val="99"/>
+    <w:semiHidden/>
+    <w:unhideWhenUsed/>
+  </w:style>
+  <w:style w:type="paragraph" w:styleId="BodyText">
     <w:name w:val="Body Text"/>
     <w:basedOn w:val="Normal"/>
-    <w:link w:val="BodyTextChar"/>
     <w:qFormat/>
     <w:pPr>
-      <w:spacing w:after="180" w:before="180"/>
+      <w:spacing w:before="180" w:after="180"/>
     </w:pPr>
   </w:style>
-  <w:style w:customStyle="1" w:styleId="FirstParagraph" w:type="paragraph">
+  <w:style w:type="paragraph" w:customStyle="1" w:styleId="FirstParagraph">
     <w:name w:val="First Paragraph"/>
     <w:basedOn w:val="BodyText"/>
     <w:next w:val="BodyText"/>
     <w:qFormat/>
   </w:style>
-  <w:style w:customStyle="1" w:styleId="Compact" w:type="paragraph">
+  <w:style w:type="paragraph" w:customStyle="1" w:styleId="Compact">
     <w:name w:val="Compact"/>
     <w:basedOn w:val="BodyText"/>
     <w:qFormat/>
     <w:pPr>
-      <w:spacing w:after="36" w:before="36"/>
+      <w:spacing w:before="36" w:after="36"/>
     </w:pPr>
   </w:style>
-  <w:style w:styleId="Title" w:type="paragraph">
+  <w:style w:type="paragraph" w:styleId="Title">
     <w:name w:val="Title"/>
     <w:basedOn w:val="Normal"/>
     <w:next w:val="BodyText"/>
@@ -1785,35 +2357,32 @@
     <w:pPr>
       <w:keepNext/>
       <w:keepLines/>
-      <w:spacing w:after="240" w:before="480"/>
+      <w:spacing w:before="480" w:after="240"/>
       <w:jc w:val="center"/>
     </w:pPr>
     <w:rPr>
-      <w:rFonts w:asciiTheme="majorHAnsi" w:cstheme="majorBidi" w:eastAsiaTheme="majorEastAsia" w:hAnsiTheme="majorHAnsi"/>
+      <w:rFonts w:asciiTheme="majorHAnsi" w:eastAsiaTheme="majorEastAsia" w:hAnsiTheme="majorHAnsi" w:cstheme="majorBidi"/>
       <w:b/>
       <w:bCs/>
-      <w:color w:themeColor="accent1" w:themeShade="B5" w:val="345A8A"/>
+      <w:color w:val="345A8A" w:themeColor="accent1" w:themeShade="B5"/>
       <w:sz w:val="36"/>
       <w:szCs w:val="36"/>
     </w:rPr>
   </w:style>
-  <w:style w:styleId="Subtitle" w:type="paragraph">
+  <w:style w:type="paragraph" w:styleId="Subtitle">
     <w:name w:val="Subtitle"/>
     <w:basedOn w:val="Title"/>
     <w:next w:val="BodyText"/>
     <w:qFormat/>
     <w:pPr>
-      <w:keepNext/>
-      <w:keepLines/>
-      <w:spacing w:after="240" w:before="240"/>
-      <w:jc w:val="center"/>
+      <w:spacing w:before="240"/>
     </w:pPr>
     <w:rPr>
       <w:sz w:val="30"/>
       <w:szCs w:val="30"/>
     </w:rPr>
   </w:style>
-  <w:style w:customStyle="1" w:styleId="Author" w:type="paragraph">
+  <w:style w:type="paragraph" w:customStyle="1" w:styleId="Author">
     <w:name w:val="Author"/>
     <w:next w:val="BodyText"/>
     <w:qFormat/>
@@ -1823,7 +2392,7 @@
       <w:jc w:val="center"/>
     </w:pPr>
   </w:style>
-  <w:style w:styleId="Date" w:type="paragraph">
+  <w:style w:type="paragraph" w:styleId="Date">
     <w:name w:val="Date"/>
     <w:next w:val="BodyText"/>
     <w:qFormat/>
@@ -1833,7 +2402,7 @@
       <w:jc w:val="center"/>
     </w:pPr>
   </w:style>
-  <w:style w:customStyle="1" w:styleId="AbstractTitle" w:type="paragraph">
+  <w:style w:type="paragraph" w:customStyle="1" w:styleId="AbstractTitle">
     <w:name w:val="Abstract Title"/>
     <w:basedOn w:val="Normal"/>
     <w:next w:val="Abstract"/>
@@ -1841,7 +2410,7 @@
     <w:pPr>
       <w:keepNext/>
       <w:keepLines/>
-      <w:spacing w:after="0" w:before="300"/>
+      <w:spacing w:before="300" w:after="0"/>
       <w:jc w:val="center"/>
     </w:pPr>
     <w:rPr>
@@ -1851,7 +2420,7 @@
       <w:szCs w:val="20"/>
     </w:rPr>
   </w:style>
-  <w:style w:customStyle="1" w:styleId="Abstract" w:type="paragraph">
+  <w:style w:type="paragraph" w:customStyle="1" w:styleId="Abstract">
     <w:name w:val="Abstract"/>
     <w:basedOn w:val="Normal"/>
     <w:next w:val="BodyText"/>
@@ -1859,210 +2428,19 @@
     <w:pPr>
       <w:keepNext/>
       <w:keepLines/>
-      <w:spacing w:after="300" w:before="100"/>
+      <w:spacing w:before="100" w:after="300"/>
     </w:pPr>
     <w:rPr>
       <w:sz w:val="20"/>
       <w:szCs w:val="20"/>
     </w:rPr>
   </w:style>
-  <w:style w:styleId="Bibliography" w:type="paragraph">
+  <w:style w:type="paragraph" w:styleId="Bibliography">
     <w:name w:val="Bibliography"/>
     <w:basedOn w:val="Normal"/>
-    <w:next w:val="Bibliography"/>
     <w:qFormat/>
-    <w:pPr/>
-    <w:rPr/>
-  </w:style>
-  <w:style w:styleId="Heading1" w:type="paragraph">
-    <w:name w:val="Heading 1"/>
-    <w:basedOn w:val="Normal"/>
-    <w:next w:val="BodyText"/>
-    <w:uiPriority w:val="9"/>
-    <w:qFormat/>
-    <w:pPr>
-      <w:keepNext/>
-      <w:keepLines/>
-      <w:spacing w:after="0" w:before="480"/>
-      <w:outlineLvl w:val="0"/>
-    </w:pPr>
-    <w:rPr>
-      <w:rFonts w:asciiTheme="majorHAnsi" w:cstheme="majorBidi" w:eastAsiaTheme="majorEastAsia" w:hAnsiTheme="majorHAnsi"/>
-      <w:b/>
-      <w:bCs/>
-      <w:color w:themeColor="accent1" w:val="4F81BD"/>
-      <w:sz w:val="32"/>
-      <w:szCs w:val="32"/>
-    </w:rPr>
-  </w:style>
-  <w:style w:styleId="Heading2" w:type="paragraph">
-    <w:name w:val="Heading 2"/>
-    <w:basedOn w:val="Normal"/>
-    <w:next w:val="BodyText"/>
-    <w:uiPriority w:val="9"/>
-    <w:unhideWhenUsed/>
-    <w:qFormat/>
-    <w:pPr>
-      <w:keepNext/>
-      <w:keepLines/>
-      <w:spacing w:after="0" w:before="200"/>
-      <w:outlineLvl w:val="1"/>
-    </w:pPr>
-    <w:rPr>
-      <w:rFonts w:asciiTheme="majorHAnsi" w:cstheme="majorBidi" w:eastAsiaTheme="majorEastAsia" w:hAnsiTheme="majorHAnsi"/>
-      <w:b/>
-      <w:bCs/>
-      <w:color w:themeColor="accent1" w:val="4F81BD"/>
-      <w:sz w:val="28"/>
-      <w:szCs w:val="28"/>
-    </w:rPr>
-  </w:style>
-  <w:style w:styleId="Heading3" w:type="paragraph">
-    <w:name w:val="Heading 3"/>
-    <w:basedOn w:val="Normal"/>
-    <w:next w:val="BodyText"/>
-    <w:uiPriority w:val="9"/>
-    <w:unhideWhenUsed/>
-    <w:qFormat/>
-    <w:pPr>
-      <w:keepNext/>
-      <w:keepLines/>
-      <w:spacing w:after="0" w:before="200"/>
-      <w:outlineLvl w:val="2"/>
-    </w:pPr>
-    <w:rPr>
-      <w:rFonts w:asciiTheme="majorHAnsi" w:cstheme="majorBidi" w:eastAsiaTheme="majorEastAsia" w:hAnsiTheme="majorHAnsi"/>
-      <w:b/>
-      <w:bCs/>
-      <w:color w:themeColor="accent1" w:val="4F81BD"/>
-      <w:sz w:val="24"/>
-      <w:szCs w:val="24"/>
-    </w:rPr>
-  </w:style>
-  <w:style w:styleId="Heading4" w:type="paragraph">
-    <w:name w:val="Heading 4"/>
-    <w:basedOn w:val="Normal"/>
-    <w:next w:val="BodyText"/>
-    <w:uiPriority w:val="9"/>
-    <w:unhideWhenUsed/>
-    <w:qFormat/>
-    <w:pPr>
-      <w:keepNext/>
-      <w:keepLines/>
-      <w:spacing w:after="0" w:before="200"/>
-      <w:outlineLvl w:val="3"/>
-    </w:pPr>
-    <w:rPr>
-      <w:rFonts w:asciiTheme="majorHAnsi" w:cstheme="majorBidi" w:eastAsiaTheme="majorEastAsia" w:hAnsiTheme="majorHAnsi"/>
-      <w:bCs/>
-      <w:i/>
-      <w:color w:themeColor="accent1" w:val="4F81BD"/>
-      <w:sz w:val="24"/>
-      <w:szCs w:val="24"/>
-    </w:rPr>
-  </w:style>
-  <w:style w:styleId="Heading5" w:type="paragraph">
-    <w:name w:val="Heading 5"/>
-    <w:basedOn w:val="Normal"/>
-    <w:next w:val="BodyText"/>
-    <w:uiPriority w:val="9"/>
-    <w:unhideWhenUsed/>
-    <w:qFormat/>
-    <w:pPr>
-      <w:keepNext/>
-      <w:keepLines/>
-      <w:spacing w:after="0" w:before="200"/>
-      <w:outlineLvl w:val="4"/>
-    </w:pPr>
-    <w:rPr>
-      <w:rFonts w:asciiTheme="majorHAnsi" w:cstheme="majorBidi" w:eastAsiaTheme="majorEastAsia" w:hAnsiTheme="majorHAnsi"/>
-      <w:iCs/>
-      <w:color w:themeColor="accent1" w:val="4F81BD"/>
-      <w:sz w:val="24"/>
-      <w:szCs w:val="24"/>
-    </w:rPr>
-  </w:style>
-  <w:style w:styleId="Heading6" w:type="paragraph">
-    <w:name w:val="Heading 6"/>
-    <w:basedOn w:val="Normal"/>
-    <w:next w:val="BodyText"/>
-    <w:uiPriority w:val="9"/>
-    <w:unhideWhenUsed/>
-    <w:qFormat/>
-    <w:pPr>
-      <w:keepNext/>
-      <w:keepLines/>
-      <w:spacing w:after="0" w:before="200"/>
-      <w:outlineLvl w:val="5"/>
-    </w:pPr>
-    <w:rPr>
-      <w:rFonts w:asciiTheme="majorHAnsi" w:cstheme="majorBidi" w:eastAsiaTheme="majorEastAsia" w:hAnsiTheme="majorHAnsi"/>
-      <w:color w:themeColor="accent1" w:val="4F81BD"/>
-      <w:sz w:val="24"/>
-      <w:szCs w:val="24"/>
-    </w:rPr>
-  </w:style>
-  <w:style w:styleId="Heading7" w:type="paragraph">
-    <w:name w:val="Heading 7"/>
-    <w:basedOn w:val="Normal"/>
-    <w:next w:val="BodyText"/>
-    <w:uiPriority w:val="9"/>
-    <w:unhideWhenUsed/>
-    <w:qFormat/>
-    <w:pPr>
-      <w:keepNext/>
-      <w:keepLines/>
-      <w:spacing w:after="0" w:before="200"/>
-      <w:outlineLvl w:val="6"/>
-    </w:pPr>
-    <w:rPr>
-      <w:rFonts w:asciiTheme="majorHAnsi" w:cstheme="majorBidi" w:eastAsiaTheme="majorEastAsia" w:hAnsiTheme="majorHAnsi"/>
-      <w:color w:themeColor="accent1" w:val="4F81BD"/>
-      <w:sz w:val="24"/>
-      <w:szCs w:val="24"/>
-    </w:rPr>
-  </w:style>
-  <w:style w:styleId="Heading8" w:type="paragraph">
-    <w:name w:val="Heading 8"/>
-    <w:basedOn w:val="Normal"/>
-    <w:next w:val="BodyText"/>
-    <w:uiPriority w:val="9"/>
-    <w:unhideWhenUsed/>
-    <w:qFormat/>
-    <w:pPr>
-      <w:keepNext/>
-      <w:keepLines/>
-      <w:spacing w:after="0" w:before="200"/>
-      <w:outlineLvl w:val="7"/>
-    </w:pPr>
-    <w:rPr>
-      <w:rFonts w:asciiTheme="majorHAnsi" w:cstheme="majorBidi" w:eastAsiaTheme="majorEastAsia" w:hAnsiTheme="majorHAnsi"/>
-      <w:color w:themeColor="accent1" w:val="4F81BD"/>
-      <w:sz w:val="24"/>
-      <w:szCs w:val="24"/>
-    </w:rPr>
-  </w:style>
-  <w:style w:styleId="Heading9" w:type="paragraph">
-    <w:name w:val="Heading 9"/>
-    <w:basedOn w:val="Normal"/>
-    <w:next w:val="BodyText"/>
-    <w:uiPriority w:val="9"/>
-    <w:unhideWhenUsed/>
-    <w:qFormat/>
-    <w:pPr>
-      <w:keepNext/>
-      <w:keepLines/>
-      <w:spacing w:after="0" w:before="200"/>
-      <w:outlineLvl w:val="8"/>
-    </w:pPr>
-    <w:rPr>
-      <w:rFonts w:asciiTheme="majorHAnsi" w:cstheme="majorBidi" w:eastAsiaTheme="majorEastAsia" w:hAnsiTheme="majorHAnsi"/>
-      <w:color w:themeColor="accent1" w:val="4F81BD"/>
-      <w:sz w:val="24"/>
-      <w:szCs w:val="24"/>
-    </w:rPr>
-  </w:style>
-  <w:style w:styleId="BlockText" w:type="paragraph">
+  </w:style>
+  <w:style w:type="paragraph" w:styleId="BlockText">
     <w:name w:val="Block Text"/>
     <w:basedOn w:val="BodyText"/>
     <w:next w:val="BodyText"/>
@@ -2070,67 +2448,57 @@
     <w:unhideWhenUsed/>
     <w:qFormat/>
     <w:pPr>
-      <w:spacing w:after="100" w:before="100"/>
-      <w:ind w:firstLine="0" w:left="480" w:right="480"/>
+      <w:spacing w:before="100" w:after="100"/>
+      <w:ind w:left="480" w:right="480"/>
     </w:pPr>
   </w:style>
-  <w:style w:styleId="FootnoteText" w:type="paragraph">
-    <w:name w:val="Footnote Text"/>
+  <w:style w:type="paragraph" w:styleId="FootnoteText">
+    <w:name w:val="footnote text"/>
     <w:basedOn w:val="Normal"/>
-    <w:next w:val="FootnoteText"/>
     <w:uiPriority w:val="9"/>
     <w:unhideWhenUsed/>
     <w:qFormat/>
   </w:style>
-  <w:style w:styleId="FootnoteBlockText" w:type="paragraph">
+  <w:style w:type="paragraph" w:customStyle="1" w:styleId="FootnoteBlockText">
     <w:name w:val="Footnote Block Text"/>
-    <w:basedOn w:val="Footnote Text"/>
-    <w:next w:val="Footnote Text"/>
     <w:uiPriority w:val="9"/>
     <w:unhideWhenUsed/>
     <w:qFormat/>
     <w:pPr>
-      <w:spacing w:after="100" w:before="100"/>
-      <w:ind w:firstLine="0" w:left="480" w:right="480"/>
+      <w:spacing w:before="100" w:after="100"/>
+      <w:ind w:left="480" w:right="480"/>
     </w:pPr>
   </w:style>
-  <w:style w:default="1" w:styleId="DefaultParagraphFont" w:type="character">
-    <w:name w:val="Default Paragraph Font"/>
-    <w:semiHidden/>
-    <w:unhideWhenUsed/>
-  </w:style>
-  <w:style w:default="1" w:styleId="Table" w:type="table">
+  <w:style w:type="table" w:customStyle="1" w:styleId="Table">
     <w:name w:val="Table"/>
-    <w:basedOn w:val="TableNormal"/>
     <w:semiHidden/>
     <w:unhideWhenUsed/>
     <w:qFormat/>
     <w:tblPr>
-      <w:tblInd w:type="dxa" w:w="0"/>
+      <w:tblInd w:w="0" w:type="dxa"/>
       <w:tblCellMar>
-        <w:top w:type="dxa" w:w="0"/>
-        <w:left w:type="dxa" w:w="108"/>
-        <w:bottom w:type="dxa" w:w="0"/>
-        <w:right w:type="dxa" w:w="108"/>
+        <w:top w:w="0" w:type="dxa"/>
+        <w:left w:w="108" w:type="dxa"/>
+        <w:bottom w:w="0" w:type="dxa"/>
+        <w:right w:w="108" w:type="dxa"/>
       </w:tblCellMar>
     </w:tblPr>
     <w:tblStylePr w:type="firstRow">
       <w:tblPr>
         <w:jc w:val="left"/>
-        <w:tblInd w:type="dxa" w:w="0"/>
       </w:tblPr>
       <w:trPr>
         <w:jc w:val="left"/>
       </w:trPr>
       <w:tcPr>
         <w:tcBorders>
-          <w:bottom w:val="single"/>
+          <w:bottom w:val="single" w:sz="0" w:space="0" w:color="auto"/>
         </w:tcBorders>
         <w:vAlign w:val="bottom"/>
       </w:tcPr>
     </w:tblStylePr>
   </w:style>
-  <w:style w:customStyle="1" w:styleId="DefinitionTerm" w:type="paragraph">
+  <w:style w:type="paragraph" w:customStyle="1" w:styleId="DefinitionTerm">
     <w:name w:val="Definition Term"/>
     <w:basedOn w:val="Normal"/>
     <w:next w:val="Definition"/>
@@ -2143,75 +2511,76 @@
       <w:b/>
     </w:rPr>
   </w:style>
-  <w:style w:customStyle="1" w:styleId="Definition" w:type="paragraph">
+  <w:style w:type="paragraph" w:customStyle="1" w:styleId="Definition">
     <w:name w:val="Definition"/>
     <w:basedOn w:val="Normal"/>
   </w:style>
-  <w:style w:styleId="Caption" w:type="paragraph">
-    <w:name w:val="Caption"/>
+  <w:style w:type="paragraph" w:styleId="Caption">
+    <w:name w:val="caption"/>
     <w:basedOn w:val="Normal"/>
-    <w:link w:val="BodyTextChar"/>
+    <w:link w:val="CaptionChar"/>
     <w:pPr>
-      <w:spacing w:after="120" w:before="0"/>
+      <w:spacing w:after="120"/>
     </w:pPr>
     <w:rPr>
       <w:i/>
     </w:rPr>
   </w:style>
-  <w:style w:customStyle="1" w:styleId="TableCaption" w:type="paragraph">
+  <w:style w:type="paragraph" w:customStyle="1" w:styleId="TableCaption">
     <w:name w:val="Table Caption"/>
     <w:basedOn w:val="Caption"/>
     <w:pPr>
       <w:keepNext/>
     </w:pPr>
   </w:style>
-  <w:style w:customStyle="1" w:styleId="ImageCaption" w:type="paragraph">
+  <w:style w:type="paragraph" w:customStyle="1" w:styleId="ImageCaption">
     <w:name w:val="Image Caption"/>
     <w:basedOn w:val="Caption"/>
   </w:style>
-  <w:style w:customStyle="1" w:styleId="Figure" w:type="paragraph">
+  <w:style w:type="paragraph" w:customStyle="1" w:styleId="Figure">
     <w:name w:val="Figure"/>
     <w:basedOn w:val="Normal"/>
   </w:style>
-  <w:style w:customStyle="1" w:styleId="CaptionedFigure" w:type="paragraph">
+  <w:style w:type="paragraph" w:customStyle="1" w:styleId="CaptionedFigure">
     <w:name w:val="Captioned Figure"/>
     <w:basedOn w:val="Figure"/>
     <w:pPr>
       <w:keepNext/>
     </w:pPr>
   </w:style>
-  <w:style w:customStyle="1" w:styleId="BodyTextChar" w:type="character">
-    <w:name w:val="Body Text Char"/>
+  <w:style w:type="character" w:customStyle="1" w:styleId="CaptionChar">
+    <w:name w:val="Caption Char"/>
     <w:basedOn w:val="DefaultParagraphFont"/>
-    <w:link w:val="BodyText"/>
-  </w:style>
-  <w:style w:customStyle="1" w:styleId="VerbatimChar" w:type="character">
+    <w:link w:val="Caption"/>
+  </w:style>
+  <w:style w:type="character" w:customStyle="1" w:styleId="VerbatimChar">
     <w:name w:val="Verbatim Char"/>
-    <w:basedOn w:val="BodyTextChar"/>
+    <w:basedOn w:val="CaptionChar"/>
+    <w:link w:val="SourceCode"/>
     <w:rPr>
       <w:rFonts w:ascii="Consolas" w:hAnsi="Consolas"/>
       <w:sz w:val="22"/>
     </w:rPr>
   </w:style>
-  <w:style w:customStyle="1" w:styleId="SectionNumber" w:type="character">
+  <w:style w:type="character" w:customStyle="1" w:styleId="SectionNumber">
     <w:name w:val="Section Number"/>
-    <w:basedOn w:val="BodyTextChar"/>
-  </w:style>
-  <w:style w:styleId="FootnoteReference" w:type="character">
-    <w:name w:val="Footnote Reference"/>
-    <w:basedOn w:val="BodyTextChar"/>
+    <w:basedOn w:val="CaptionChar"/>
+  </w:style>
+  <w:style w:type="character" w:styleId="FootnoteReference">
+    <w:name w:val="footnote reference"/>
+    <w:basedOn w:val="CaptionChar"/>
     <w:rPr>
       <w:vertAlign w:val="superscript"/>
     </w:rPr>
   </w:style>
-  <w:style w:styleId="Hyperlink" w:type="character">
+  <w:style w:type="character" w:styleId="Hyperlink">
     <w:name w:val="Hyperlink"/>
-    <w:basedOn w:val="BodyTextChar"/>
-    <w:rPr>
-      <w:color w:themeColor="accent1" w:val="4F81BD"/>
-    </w:rPr>
-  </w:style>
-  <w:style w:styleId="TOCHeading" w:type="paragraph">
+    <w:basedOn w:val="CaptionChar"/>
+    <w:rPr>
+      <w:color w:val="4F81BD" w:themeColor="accent1"/>
+    </w:rPr>
+  </w:style>
+  <w:style w:type="paragraph" w:styleId="TOCHeading">
     <w:name w:val="TOC Heading"/>
     <w:basedOn w:val="Heading1"/>
     <w:next w:val="BodyText"/>
@@ -2223,10 +2592,9 @@
       <w:outlineLvl w:val="9"/>
     </w:pPr>
     <w:rPr>
-      <w:rFonts w:asciiTheme="majorHAnsi" w:cstheme="majorBidi" w:eastAsiaTheme="majorEastAsia" w:hAnsiTheme="majorHAnsi"/>
       <w:b w:val="0"/>
       <w:bCs w:val="0"/>
-      <w:color w:themeColor="accent1" w:themeShade="BF" w:val="365F91"/>
+      <w:color w:val="365F91" w:themeColor="accent1" w:themeShade="BF"/>
     </w:rPr>
   </w:style>
   <w:style w:type="paragraph" w:customStyle="1" w:styleId="SourceCode">
@@ -2234,234 +2602,299 @@
     <w:basedOn w:val="Normal"/>
     <w:link w:val="VerbatimChar"/>
     <w:pPr>
-      <w:wordWrap w:val="off"/>
+      <w:wordWrap w:val="0"/>
     </w:pPr>
   </w:style>
   <w:style w:type="character" w:customStyle="1" w:styleId="KeywordTok">
     <w:name w:val="KeywordTok"/>
     <w:basedOn w:val="VerbatimChar"/>
     <w:rPr>
+      <w:rFonts w:ascii="Consolas" w:hAnsi="Consolas"/>
       <w:b/>
       <w:color w:val="007020"/>
+      <w:sz w:val="22"/>
     </w:rPr>
   </w:style>
   <w:style w:type="character" w:customStyle="1" w:styleId="DataTypeTok">
     <w:name w:val="DataTypeTok"/>
     <w:basedOn w:val="VerbatimChar"/>
     <w:rPr>
+      <w:rFonts w:ascii="Consolas" w:hAnsi="Consolas"/>
       <w:color w:val="902000"/>
+      <w:sz w:val="22"/>
     </w:rPr>
   </w:style>
   <w:style w:type="character" w:customStyle="1" w:styleId="DecValTok">
     <w:name w:val="DecValTok"/>
     <w:basedOn w:val="VerbatimChar"/>
     <w:rPr>
-      <w:color w:val="40a070"/>
+      <w:rFonts w:ascii="Consolas" w:hAnsi="Consolas"/>
+      <w:color w:val="40A070"/>
+      <w:sz w:val="22"/>
     </w:rPr>
   </w:style>
   <w:style w:type="character" w:customStyle="1" w:styleId="BaseNTok">
     <w:name w:val="BaseNTok"/>
     <w:basedOn w:val="VerbatimChar"/>
     <w:rPr>
-      <w:color w:val="40a070"/>
+      <w:rFonts w:ascii="Consolas" w:hAnsi="Consolas"/>
+      <w:color w:val="40A070"/>
+      <w:sz w:val="22"/>
     </w:rPr>
   </w:style>
   <w:style w:type="character" w:customStyle="1" w:styleId="FloatTok">
     <w:name w:val="FloatTok"/>
     <w:basedOn w:val="VerbatimChar"/>
     <w:rPr>
-      <w:color w:val="40a070"/>
+      <w:rFonts w:ascii="Consolas" w:hAnsi="Consolas"/>
+      <w:color w:val="40A070"/>
+      <w:sz w:val="22"/>
     </w:rPr>
   </w:style>
   <w:style w:type="character" w:customStyle="1" w:styleId="ConstantTok">
     <w:name w:val="ConstantTok"/>
     <w:basedOn w:val="VerbatimChar"/>
     <w:rPr>
+      <w:rFonts w:ascii="Consolas" w:hAnsi="Consolas"/>
       <w:color w:val="880000"/>
+      <w:sz w:val="22"/>
     </w:rPr>
   </w:style>
   <w:style w:type="character" w:customStyle="1" w:styleId="CharTok">
     <w:name w:val="CharTok"/>
     <w:basedOn w:val="VerbatimChar"/>
     <w:rPr>
-      <w:color w:val="4070a0"/>
+      <w:rFonts w:ascii="Consolas" w:hAnsi="Consolas"/>
+      <w:color w:val="4070A0"/>
+      <w:sz w:val="22"/>
     </w:rPr>
   </w:style>
   <w:style w:type="character" w:customStyle="1" w:styleId="SpecialCharTok">
     <w:name w:val="SpecialCharTok"/>
     <w:basedOn w:val="VerbatimChar"/>
     <w:rPr>
-      <w:color w:val="4070a0"/>
+      <w:rFonts w:ascii="Consolas" w:hAnsi="Consolas"/>
+      <w:color w:val="4070A0"/>
+      <w:sz w:val="22"/>
     </w:rPr>
   </w:style>
   <w:style w:type="character" w:customStyle="1" w:styleId="StringTok">
     <w:name w:val="StringTok"/>
     <w:basedOn w:val="VerbatimChar"/>
     <w:rPr>
-      <w:color w:val="4070a0"/>
+      <w:rFonts w:ascii="Consolas" w:hAnsi="Consolas"/>
+      <w:color w:val="4070A0"/>
+      <w:sz w:val="22"/>
     </w:rPr>
   </w:style>
   <w:style w:type="character" w:customStyle="1" w:styleId="VerbatimStringTok">
     <w:name w:val="VerbatimStringTok"/>
     <w:basedOn w:val="VerbatimChar"/>
     <w:rPr>
-      <w:color w:val="4070a0"/>
+      <w:rFonts w:ascii="Consolas" w:hAnsi="Consolas"/>
+      <w:color w:val="4070A0"/>
+      <w:sz w:val="22"/>
     </w:rPr>
   </w:style>
   <w:style w:type="character" w:customStyle="1" w:styleId="SpecialStringTok">
     <w:name w:val="SpecialStringTok"/>
     <w:basedOn w:val="VerbatimChar"/>
     <w:rPr>
-      <w:color w:val="bb6688"/>
+      <w:rFonts w:ascii="Consolas" w:hAnsi="Consolas"/>
+      <w:color w:val="BB6688"/>
+      <w:sz w:val="22"/>
     </w:rPr>
   </w:style>
   <w:style w:type="character" w:customStyle="1" w:styleId="ImportTok">
     <w:name w:val="ImportTok"/>
     <w:basedOn w:val="VerbatimChar"/>
     <w:rPr>
+      <w:rFonts w:ascii="Consolas" w:hAnsi="Consolas"/>
       <w:b/>
       <w:color w:val="008000"/>
+      <w:sz w:val="22"/>
     </w:rPr>
   </w:style>
   <w:style w:type="character" w:customStyle="1" w:styleId="CommentTok">
     <w:name w:val="CommentTok"/>
     <w:basedOn w:val="VerbatimChar"/>
     <w:rPr>
+      <w:rFonts w:ascii="Consolas" w:hAnsi="Consolas"/>
       <w:i/>
-      <w:color w:val="60a0b0"/>
+      <w:color w:val="60A0B0"/>
+      <w:sz w:val="22"/>
     </w:rPr>
   </w:style>
   <w:style w:type="character" w:customStyle="1" w:styleId="DocumentationTok">
     <w:name w:val="DocumentationTok"/>
     <w:basedOn w:val="VerbatimChar"/>
     <w:rPr>
+      <w:rFonts w:ascii="Consolas" w:hAnsi="Consolas"/>
       <w:i/>
-      <w:color w:val="ba2121"/>
+      <w:color w:val="BA2121"/>
+      <w:sz w:val="22"/>
     </w:rPr>
   </w:style>
   <w:style w:type="character" w:customStyle="1" w:styleId="AnnotationTok">
     <w:name w:val="AnnotationTok"/>
     <w:basedOn w:val="VerbatimChar"/>
     <w:rPr>
+      <w:rFonts w:ascii="Consolas" w:hAnsi="Consolas"/>
       <w:b/>
       <w:i/>
-      <w:color w:val="60a0b0"/>
+      <w:color w:val="60A0B0"/>
+      <w:sz w:val="22"/>
     </w:rPr>
   </w:style>
   <w:style w:type="character" w:customStyle="1" w:styleId="CommentVarTok">
     <w:name w:val="CommentVarTok"/>
     <w:basedOn w:val="VerbatimChar"/>
     <w:rPr>
+      <w:rFonts w:ascii="Consolas" w:hAnsi="Consolas"/>
       <w:b/>
       <w:i/>
-      <w:color w:val="60a0b0"/>
+      <w:color w:val="60A0B0"/>
+      <w:sz w:val="22"/>
     </w:rPr>
   </w:style>
   <w:style w:type="character" w:customStyle="1" w:styleId="OtherTok">
     <w:name w:val="OtherTok"/>
     <w:basedOn w:val="VerbatimChar"/>
     <w:rPr>
+      <w:rFonts w:ascii="Consolas" w:hAnsi="Consolas"/>
       <w:color w:val="007020"/>
+      <w:sz w:val="22"/>
     </w:rPr>
   </w:style>
   <w:style w:type="character" w:customStyle="1" w:styleId="FunctionTok">
     <w:name w:val="FunctionTok"/>
     <w:basedOn w:val="VerbatimChar"/>
     <w:rPr>
-      <w:color w:val="06287e"/>
+      <w:rFonts w:ascii="Consolas" w:hAnsi="Consolas"/>
+      <w:color w:val="06287E"/>
+      <w:sz w:val="22"/>
     </w:rPr>
   </w:style>
   <w:style w:type="character" w:customStyle="1" w:styleId="VariableTok">
     <w:name w:val="VariableTok"/>
     <w:basedOn w:val="VerbatimChar"/>
     <w:rPr>
-      <w:color w:val="19177c"/>
+      <w:rFonts w:ascii="Consolas" w:hAnsi="Consolas"/>
+      <w:color w:val="19177C"/>
+      <w:sz w:val="22"/>
     </w:rPr>
   </w:style>
   <w:style w:type="character" w:customStyle="1" w:styleId="ControlFlowTok">
     <w:name w:val="ControlFlowTok"/>
     <w:basedOn w:val="VerbatimChar"/>
     <w:rPr>
+      <w:rFonts w:ascii="Consolas" w:hAnsi="Consolas"/>
       <w:b/>
       <w:color w:val="007020"/>
+      <w:sz w:val="22"/>
     </w:rPr>
   </w:style>
   <w:style w:type="character" w:customStyle="1" w:styleId="OperatorTok">
     <w:name w:val="OperatorTok"/>
     <w:basedOn w:val="VerbatimChar"/>
     <w:rPr>
+      <w:rFonts w:ascii="Consolas" w:hAnsi="Consolas"/>
       <w:color w:val="666666"/>
+      <w:sz w:val="22"/>
     </w:rPr>
   </w:style>
   <w:style w:type="character" w:customStyle="1" w:styleId="BuiltInTok">
     <w:name w:val="BuiltInTok"/>
     <w:basedOn w:val="VerbatimChar"/>
     <w:rPr>
+      <w:rFonts w:ascii="Consolas" w:hAnsi="Consolas"/>
       <w:color w:val="008000"/>
+      <w:sz w:val="22"/>
     </w:rPr>
   </w:style>
   <w:style w:type="character" w:customStyle="1" w:styleId="ExtensionTok">
     <w:name w:val="ExtensionTok"/>
     <w:basedOn w:val="VerbatimChar"/>
-    <w:rPr/>
+    <w:rPr>
+      <w:rFonts w:ascii="Consolas" w:hAnsi="Consolas"/>
+      <w:sz w:val="22"/>
+    </w:rPr>
   </w:style>
   <w:style w:type="character" w:customStyle="1" w:styleId="PreprocessorTok">
     <w:name w:val="PreprocessorTok"/>
     <w:basedOn w:val="VerbatimChar"/>
     <w:rPr>
-      <w:color w:val="bc7a00"/>
+      <w:rFonts w:ascii="Consolas" w:hAnsi="Consolas"/>
+      <w:color w:val="BC7A00"/>
+      <w:sz w:val="22"/>
     </w:rPr>
   </w:style>
   <w:style w:type="character" w:customStyle="1" w:styleId="AttributeTok">
     <w:name w:val="AttributeTok"/>
     <w:basedOn w:val="VerbatimChar"/>
     <w:rPr>
-      <w:color w:val="7d9029"/>
+      <w:rFonts w:ascii="Consolas" w:hAnsi="Consolas"/>
+      <w:color w:val="7D9029"/>
+      <w:sz w:val="22"/>
     </w:rPr>
   </w:style>
   <w:style w:type="character" w:customStyle="1" w:styleId="RegionMarkerTok">
     <w:name w:val="RegionMarkerTok"/>
     <w:basedOn w:val="VerbatimChar"/>
-    <w:rPr/>
+    <w:rPr>
+      <w:rFonts w:ascii="Consolas" w:hAnsi="Consolas"/>
+      <w:sz w:val="22"/>
+    </w:rPr>
   </w:style>
   <w:style w:type="character" w:customStyle="1" w:styleId="InformationTok">
     <w:name w:val="InformationTok"/>
     <w:basedOn w:val="VerbatimChar"/>
     <w:rPr>
+      <w:rFonts w:ascii="Consolas" w:hAnsi="Consolas"/>
       <w:b/>
       <w:i/>
-      <w:color w:val="60a0b0"/>
+      <w:color w:val="60A0B0"/>
+      <w:sz w:val="22"/>
     </w:rPr>
   </w:style>
   <w:style w:type="character" w:customStyle="1" w:styleId="WarningTok">
     <w:name w:val="WarningTok"/>
     <w:basedOn w:val="VerbatimChar"/>
     <w:rPr>
+      <w:rFonts w:ascii="Consolas" w:hAnsi="Consolas"/>
       <w:b/>
       <w:i/>
-      <w:color w:val="60a0b0"/>
+      <w:color w:val="60A0B0"/>
+      <w:sz w:val="22"/>
     </w:rPr>
   </w:style>
   <w:style w:type="character" w:customStyle="1" w:styleId="AlertTok">
     <w:name w:val="AlertTok"/>
     <w:basedOn w:val="VerbatimChar"/>
     <w:rPr>
+      <w:rFonts w:ascii="Consolas" w:hAnsi="Consolas"/>
       <w:b/>
-      <w:color w:val="ff0000"/>
+      <w:color w:val="FF0000"/>
+      <w:sz w:val="22"/>
     </w:rPr>
   </w:style>
   <w:style w:type="character" w:customStyle="1" w:styleId="ErrorTok">
     <w:name w:val="ErrorTok"/>
     <w:basedOn w:val="VerbatimChar"/>
     <w:rPr>
+      <w:rFonts w:ascii="Consolas" w:hAnsi="Consolas"/>
       <w:b/>
-      <w:color w:val="ff0000"/>
+      <w:color w:val="FF0000"/>
+      <w:sz w:val="22"/>
     </w:rPr>
   </w:style>
   <w:style w:type="character" w:customStyle="1" w:styleId="NormalTok">
     <w:name w:val="NormalTok"/>
     <w:basedOn w:val="VerbatimChar"/>
-    <w:rPr/>
+    <w:rPr>
+      <w:rFonts w:ascii="Consolas" w:hAnsi="Consolas"/>
+      <w:sz w:val="22"/>
+    </w:rPr>
   </w:style>
 </w:styles>
 </file>

</xml_diff>